<commit_message>
added CFD simulation files, updated report, updated CAD files
added CFD simulation files, updated report, updated CAD files
</commit_message>
<xml_diff>
--- a/Micro Nozzle design report.docx
+++ b/Micro Nozzle design report.docx
@@ -31,7 +31,7 @@
       <w:pPr>
         <w:pStyle w:val="Heading1"/>
       </w:pPr>
-      <w:bookmarkStart w:id="0" w:name="_Toc198300835"/>
+      <w:bookmarkStart w:id="0" w:name="_Toc199943854"/>
       <w:r>
         <w:t>Executive Summary</w:t>
       </w:r>
@@ -94,7 +94,7 @@
             <w:rPr>
               <w:rFonts w:eastAsiaTheme="minorEastAsia"/>
               <w:noProof/>
-              <w:lang w:eastAsia="zh-CN"/>
+              <w:lang w:val="en-US" w:eastAsia="zh-CN"/>
             </w:rPr>
           </w:pPr>
           <w:r>
@@ -106,7 +106,7 @@
           <w:r>
             <w:fldChar w:fldCharType="separate"/>
           </w:r>
-          <w:hyperlink w:anchor="_Toc198300835" w:history="1">
+          <w:hyperlink w:anchor="_Toc199943854" w:history="1">
             <w:r>
               <w:rPr>
                 <w:rStyle w:val="Hyperlink"/>
@@ -133,7 +133,7 @@
                 <w:noProof/>
                 <w:webHidden/>
               </w:rPr>
-              <w:instrText xml:space="preserve"> PAGEREF _Toc198300835 \h </w:instrText>
+              <w:instrText xml:space="preserve"> PAGEREF _Toc199943854 \h </w:instrText>
             </w:r>
             <w:r>
               <w:rPr>
@@ -174,10 +174,10 @@
             <w:rPr>
               <w:rFonts w:eastAsiaTheme="minorEastAsia"/>
               <w:noProof/>
-              <w:lang w:eastAsia="zh-CN"/>
+              <w:lang w:val="en-US" w:eastAsia="zh-CN"/>
             </w:rPr>
           </w:pPr>
-          <w:hyperlink w:anchor="_Toc198300836" w:history="1">
+          <w:hyperlink w:anchor="_Toc199943855" w:history="1">
             <w:r>
               <w:rPr>
                 <w:rStyle w:val="Hyperlink"/>
@@ -189,7 +189,7 @@
               <w:rPr>
                 <w:rFonts w:eastAsiaTheme="minorEastAsia"/>
                 <w:noProof/>
-                <w:lang w:eastAsia="zh-CN"/>
+                <w:lang w:val="en-US" w:eastAsia="zh-CN"/>
               </w:rPr>
               <w:tab/>
             </w:r>
@@ -219,7 +219,7 @@
                 <w:noProof/>
                 <w:webHidden/>
               </w:rPr>
-              <w:instrText xml:space="preserve"> PAGEREF _Toc198300836 \h </w:instrText>
+              <w:instrText xml:space="preserve"> PAGEREF _Toc199943855 \h </w:instrText>
             </w:r>
             <w:r>
               <w:rPr>
@@ -260,10 +260,10 @@
             <w:rPr>
               <w:rFonts w:eastAsiaTheme="minorEastAsia"/>
               <w:noProof/>
-              <w:lang w:eastAsia="zh-CN"/>
+              <w:lang w:val="en-US" w:eastAsia="zh-CN"/>
             </w:rPr>
           </w:pPr>
-          <w:hyperlink w:anchor="_Toc198300837" w:history="1">
+          <w:hyperlink w:anchor="_Toc199943856" w:history="1">
             <w:r>
               <w:rPr>
                 <w:rStyle w:val="Hyperlink"/>
@@ -275,7 +275,7 @@
               <w:rPr>
                 <w:rFonts w:eastAsiaTheme="minorEastAsia"/>
                 <w:noProof/>
-                <w:lang w:eastAsia="zh-CN"/>
+                <w:lang w:val="en-US" w:eastAsia="zh-CN"/>
               </w:rPr>
               <w:tab/>
             </w:r>
@@ -305,7 +305,7 @@
                 <w:noProof/>
                 <w:webHidden/>
               </w:rPr>
-              <w:instrText xml:space="preserve"> PAGEREF _Toc198300837 \h </w:instrText>
+              <w:instrText xml:space="preserve"> PAGEREF _Toc199943856 \h </w:instrText>
             </w:r>
             <w:r>
               <w:rPr>
@@ -346,10 +346,10 @@
             <w:rPr>
               <w:rFonts w:eastAsiaTheme="minorEastAsia"/>
               <w:noProof/>
-              <w:lang w:eastAsia="zh-CN"/>
+              <w:lang w:val="en-US" w:eastAsia="zh-CN"/>
             </w:rPr>
           </w:pPr>
-          <w:hyperlink w:anchor="_Toc198300838" w:history="1">
+          <w:hyperlink w:anchor="_Toc199943857" w:history="1">
             <w:r>
               <w:rPr>
                 <w:rStyle w:val="Hyperlink"/>
@@ -361,7 +361,7 @@
               <w:rPr>
                 <w:rFonts w:eastAsiaTheme="minorEastAsia"/>
                 <w:noProof/>
-                <w:lang w:eastAsia="zh-CN"/>
+                <w:lang w:val="en-US" w:eastAsia="zh-CN"/>
               </w:rPr>
               <w:tab/>
             </w:r>
@@ -391,7 +391,7 @@
                 <w:noProof/>
                 <w:webHidden/>
               </w:rPr>
-              <w:instrText xml:space="preserve"> PAGEREF _Toc198300838 \h </w:instrText>
+              <w:instrText xml:space="preserve"> PAGEREF _Toc199943857 \h </w:instrText>
             </w:r>
             <w:r>
               <w:rPr>
@@ -432,10 +432,10 @@
             <w:rPr>
               <w:rFonts w:eastAsiaTheme="minorEastAsia"/>
               <w:noProof/>
-              <w:lang w:eastAsia="zh-CN"/>
+              <w:lang w:val="en-US" w:eastAsia="zh-CN"/>
             </w:rPr>
           </w:pPr>
-          <w:hyperlink w:anchor="_Toc198300839" w:history="1">
+          <w:hyperlink w:anchor="_Toc199943858" w:history="1">
             <w:r>
               <w:rPr>
                 <w:rStyle w:val="Hyperlink"/>
@@ -447,7 +447,7 @@
               <w:rPr>
                 <w:rFonts w:eastAsiaTheme="minorEastAsia"/>
                 <w:noProof/>
-                <w:lang w:eastAsia="zh-CN"/>
+                <w:lang w:val="en-US" w:eastAsia="zh-CN"/>
               </w:rPr>
               <w:tab/>
             </w:r>
@@ -477,7 +477,7 @@
                 <w:noProof/>
                 <w:webHidden/>
               </w:rPr>
-              <w:instrText xml:space="preserve"> PAGEREF _Toc198300839 \h </w:instrText>
+              <w:instrText xml:space="preserve"> PAGEREF _Toc199943858 \h </w:instrText>
             </w:r>
             <w:r>
               <w:rPr>
@@ -518,10 +518,10 @@
             <w:rPr>
               <w:rFonts w:eastAsiaTheme="minorEastAsia"/>
               <w:noProof/>
-              <w:lang w:eastAsia="zh-CN"/>
+              <w:lang w:val="en-US" w:eastAsia="zh-CN"/>
             </w:rPr>
           </w:pPr>
-          <w:hyperlink w:anchor="_Toc198300840" w:history="1">
+          <w:hyperlink w:anchor="_Toc199943859" w:history="1">
             <w:r>
               <w:rPr>
                 <w:rStyle w:val="Hyperlink"/>
@@ -533,7 +533,7 @@
               <w:rPr>
                 <w:rFonts w:eastAsiaTheme="minorEastAsia"/>
                 <w:noProof/>
-                <w:lang w:eastAsia="zh-CN"/>
+                <w:lang w:val="en-US" w:eastAsia="zh-CN"/>
               </w:rPr>
               <w:tab/>
             </w:r>
@@ -563,7 +563,7 @@
                 <w:noProof/>
                 <w:webHidden/>
               </w:rPr>
-              <w:instrText xml:space="preserve"> PAGEREF _Toc198300840 \h </w:instrText>
+              <w:instrText xml:space="preserve"> PAGEREF _Toc199943859 \h </w:instrText>
             </w:r>
             <w:r>
               <w:rPr>
@@ -604,10 +604,10 @@
             <w:rPr>
               <w:rFonts w:eastAsiaTheme="minorEastAsia"/>
               <w:noProof/>
-              <w:lang w:eastAsia="zh-CN"/>
+              <w:lang w:val="en-US" w:eastAsia="zh-CN"/>
             </w:rPr>
           </w:pPr>
-          <w:hyperlink w:anchor="_Toc198300841" w:history="1">
+          <w:hyperlink w:anchor="_Toc199943860" w:history="1">
             <w:r>
               <w:rPr>
                 <w:rStyle w:val="Hyperlink"/>
@@ -619,7 +619,7 @@
               <w:rPr>
                 <w:rFonts w:eastAsiaTheme="minorEastAsia"/>
                 <w:noProof/>
-                <w:lang w:eastAsia="zh-CN"/>
+                <w:lang w:val="en-US" w:eastAsia="zh-CN"/>
               </w:rPr>
               <w:tab/>
             </w:r>
@@ -649,7 +649,7 @@
                 <w:noProof/>
                 <w:webHidden/>
               </w:rPr>
-              <w:instrText xml:space="preserve"> PAGEREF _Toc198300841 \h </w:instrText>
+              <w:instrText xml:space="preserve"> PAGEREF _Toc199943860 \h </w:instrText>
             </w:r>
             <w:r>
               <w:rPr>
@@ -690,10 +690,10 @@
             <w:rPr>
               <w:rFonts w:eastAsiaTheme="minorEastAsia"/>
               <w:noProof/>
-              <w:lang w:eastAsia="zh-CN"/>
+              <w:lang w:val="en-US" w:eastAsia="zh-CN"/>
             </w:rPr>
           </w:pPr>
-          <w:hyperlink w:anchor="_Toc198300842" w:history="1">
+          <w:hyperlink w:anchor="_Toc199943861" w:history="1">
             <w:r>
               <w:rPr>
                 <w:rStyle w:val="Hyperlink"/>
@@ -705,7 +705,7 @@
               <w:rPr>
                 <w:rFonts w:eastAsiaTheme="minorEastAsia"/>
                 <w:noProof/>
-                <w:lang w:eastAsia="zh-CN"/>
+                <w:lang w:val="en-US" w:eastAsia="zh-CN"/>
               </w:rPr>
               <w:tab/>
             </w:r>
@@ -735,7 +735,7 @@
                 <w:noProof/>
                 <w:webHidden/>
               </w:rPr>
-              <w:instrText xml:space="preserve"> PAGEREF _Toc198300842 \h </w:instrText>
+              <w:instrText xml:space="preserve"> PAGEREF _Toc199943861 \h </w:instrText>
             </w:r>
             <w:r>
               <w:rPr>
@@ -776,10 +776,10 @@
             <w:rPr>
               <w:rFonts w:eastAsiaTheme="minorEastAsia"/>
               <w:noProof/>
-              <w:lang w:eastAsia="zh-CN"/>
+              <w:lang w:val="en-US" w:eastAsia="zh-CN"/>
             </w:rPr>
           </w:pPr>
-          <w:hyperlink w:anchor="_Toc198300843" w:history="1">
+          <w:hyperlink w:anchor="_Toc199943862" w:history="1">
             <w:r>
               <w:rPr>
                 <w:rStyle w:val="Hyperlink"/>
@@ -791,7 +791,7 @@
               <w:rPr>
                 <w:rFonts w:eastAsiaTheme="minorEastAsia"/>
                 <w:noProof/>
-                <w:lang w:eastAsia="zh-CN"/>
+                <w:lang w:val="en-US" w:eastAsia="zh-CN"/>
               </w:rPr>
               <w:tab/>
             </w:r>
@@ -821,7 +821,7 @@
                 <w:noProof/>
                 <w:webHidden/>
               </w:rPr>
-              <w:instrText xml:space="preserve"> PAGEREF _Toc198300843 \h </w:instrText>
+              <w:instrText xml:space="preserve"> PAGEREF _Toc199943862 \h </w:instrText>
             </w:r>
             <w:r>
               <w:rPr>
@@ -862,10 +862,10 @@
             <w:rPr>
               <w:rFonts w:eastAsiaTheme="minorEastAsia"/>
               <w:noProof/>
-              <w:lang w:eastAsia="zh-CN"/>
+              <w:lang w:val="en-US" w:eastAsia="zh-CN"/>
             </w:rPr>
           </w:pPr>
-          <w:hyperlink w:anchor="_Toc198300844" w:history="1">
+          <w:hyperlink w:anchor="_Toc199943863" w:history="1">
             <w:r>
               <w:rPr>
                 <w:rStyle w:val="Hyperlink"/>
@@ -877,7 +877,7 @@
               <w:rPr>
                 <w:rFonts w:eastAsiaTheme="minorEastAsia"/>
                 <w:noProof/>
-                <w:lang w:eastAsia="zh-CN"/>
+                <w:lang w:val="en-US" w:eastAsia="zh-CN"/>
               </w:rPr>
               <w:tab/>
             </w:r>
@@ -907,7 +907,7 @@
                 <w:noProof/>
                 <w:webHidden/>
               </w:rPr>
-              <w:instrText xml:space="preserve"> PAGEREF _Toc198300844 \h </w:instrText>
+              <w:instrText xml:space="preserve"> PAGEREF _Toc199943863 \h </w:instrText>
             </w:r>
             <w:r>
               <w:rPr>
@@ -927,7 +927,7 @@
                 <w:noProof/>
                 <w:webHidden/>
               </w:rPr>
-              <w:t>6</w:t>
+              <w:t>7</w:t>
             </w:r>
             <w:r>
               <w:rPr>
@@ -948,10 +948,10 @@
             <w:rPr>
               <w:rFonts w:eastAsiaTheme="minorEastAsia"/>
               <w:noProof/>
-              <w:lang w:eastAsia="zh-CN"/>
+              <w:lang w:val="en-US" w:eastAsia="zh-CN"/>
             </w:rPr>
           </w:pPr>
-          <w:hyperlink w:anchor="_Toc198300845" w:history="1">
+          <w:hyperlink w:anchor="_Toc199943864" w:history="1">
             <w:r>
               <w:rPr>
                 <w:rStyle w:val="Hyperlink"/>
@@ -963,7 +963,7 @@
               <w:rPr>
                 <w:rFonts w:eastAsiaTheme="minorEastAsia"/>
                 <w:noProof/>
-                <w:lang w:eastAsia="zh-CN"/>
+                <w:lang w:val="en-US" w:eastAsia="zh-CN"/>
               </w:rPr>
               <w:tab/>
             </w:r>
@@ -993,7 +993,7 @@
                 <w:noProof/>
                 <w:webHidden/>
               </w:rPr>
-              <w:instrText xml:space="preserve"> PAGEREF _Toc198300845 \h </w:instrText>
+              <w:instrText xml:space="preserve"> PAGEREF _Toc199943864 \h </w:instrText>
             </w:r>
             <w:r>
               <w:rPr>
@@ -1013,7 +1013,7 @@
                 <w:noProof/>
                 <w:webHidden/>
               </w:rPr>
-              <w:t>6</w:t>
+              <w:t>7</w:t>
             </w:r>
             <w:r>
               <w:rPr>
@@ -1034,10 +1034,10 @@
             <w:rPr>
               <w:rFonts w:eastAsiaTheme="minorEastAsia"/>
               <w:noProof/>
-              <w:lang w:eastAsia="zh-CN"/>
+              <w:lang w:val="en-US" w:eastAsia="zh-CN"/>
             </w:rPr>
           </w:pPr>
-          <w:hyperlink w:anchor="_Toc198300846" w:history="1">
+          <w:hyperlink w:anchor="_Toc199943865" w:history="1">
             <w:r>
               <w:rPr>
                 <w:rStyle w:val="Hyperlink"/>
@@ -1049,7 +1049,7 @@
               <w:rPr>
                 <w:rFonts w:eastAsiaTheme="minorEastAsia"/>
                 <w:noProof/>
-                <w:lang w:eastAsia="zh-CN"/>
+                <w:lang w:val="en-US" w:eastAsia="zh-CN"/>
               </w:rPr>
               <w:tab/>
             </w:r>
@@ -1079,7 +1079,7 @@
                 <w:noProof/>
                 <w:webHidden/>
               </w:rPr>
-              <w:instrText xml:space="preserve"> PAGEREF _Toc198300846 \h </w:instrText>
+              <w:instrText xml:space="preserve"> PAGEREF _Toc199943865 \h </w:instrText>
             </w:r>
             <w:r>
               <w:rPr>
@@ -1099,7 +1099,7 @@
                 <w:noProof/>
                 <w:webHidden/>
               </w:rPr>
-              <w:t>6</w:t>
+              <w:t>8</w:t>
             </w:r>
             <w:r>
               <w:rPr>
@@ -1120,10 +1120,10 @@
             <w:rPr>
               <w:rFonts w:eastAsiaTheme="minorEastAsia"/>
               <w:noProof/>
-              <w:lang w:eastAsia="zh-CN"/>
+              <w:lang w:val="en-US" w:eastAsia="zh-CN"/>
             </w:rPr>
           </w:pPr>
-          <w:hyperlink w:anchor="_Toc198300847" w:history="1">
+          <w:hyperlink w:anchor="_Toc199943866" w:history="1">
             <w:r>
               <w:rPr>
                 <w:rStyle w:val="Hyperlink"/>
@@ -1135,7 +1135,7 @@
               <w:rPr>
                 <w:rFonts w:eastAsiaTheme="minorEastAsia"/>
                 <w:noProof/>
-                <w:lang w:eastAsia="zh-CN"/>
+                <w:lang w:val="en-US" w:eastAsia="zh-CN"/>
               </w:rPr>
               <w:tab/>
             </w:r>
@@ -1165,7 +1165,7 @@
                 <w:noProof/>
                 <w:webHidden/>
               </w:rPr>
-              <w:instrText xml:space="preserve"> PAGEREF _Toc198300847 \h </w:instrText>
+              <w:instrText xml:space="preserve"> PAGEREF _Toc199943866 \h </w:instrText>
             </w:r>
             <w:r>
               <w:rPr>
@@ -1185,7 +1185,7 @@
                 <w:noProof/>
                 <w:webHidden/>
               </w:rPr>
-              <w:t>8</w:t>
+              <w:t>9</w:t>
             </w:r>
             <w:r>
               <w:rPr>
@@ -1206,10 +1206,10 @@
             <w:rPr>
               <w:rFonts w:eastAsiaTheme="minorEastAsia"/>
               <w:noProof/>
-              <w:lang w:eastAsia="zh-CN"/>
+              <w:lang w:val="en-US" w:eastAsia="zh-CN"/>
             </w:rPr>
           </w:pPr>
-          <w:hyperlink w:anchor="_Toc198300848" w:history="1">
+          <w:hyperlink w:anchor="_Toc199943867" w:history="1">
             <w:r>
               <w:rPr>
                 <w:rStyle w:val="Hyperlink"/>
@@ -1221,7 +1221,7 @@
               <w:rPr>
                 <w:rFonts w:eastAsiaTheme="minorEastAsia"/>
                 <w:noProof/>
-                <w:lang w:eastAsia="zh-CN"/>
+                <w:lang w:val="en-US" w:eastAsia="zh-CN"/>
               </w:rPr>
               <w:tab/>
             </w:r>
@@ -1251,7 +1251,7 @@
                 <w:noProof/>
                 <w:webHidden/>
               </w:rPr>
-              <w:instrText xml:space="preserve"> PAGEREF _Toc198300848 \h </w:instrText>
+              <w:instrText xml:space="preserve"> PAGEREF _Toc199943867 \h </w:instrText>
             </w:r>
             <w:r>
               <w:rPr>
@@ -1271,7 +1271,7 @@
                 <w:noProof/>
                 <w:webHidden/>
               </w:rPr>
-              <w:t>8</w:t>
+              <w:t>9</w:t>
             </w:r>
             <w:r>
               <w:rPr>
@@ -1292,10 +1292,10 @@
             <w:rPr>
               <w:rFonts w:eastAsiaTheme="minorEastAsia"/>
               <w:noProof/>
-              <w:lang w:eastAsia="zh-CN"/>
+              <w:lang w:val="en-US" w:eastAsia="zh-CN"/>
             </w:rPr>
           </w:pPr>
-          <w:hyperlink w:anchor="_Toc198300849" w:history="1">
+          <w:hyperlink w:anchor="_Toc199943868" w:history="1">
             <w:r>
               <w:rPr>
                 <w:rStyle w:val="Hyperlink"/>
@@ -1307,7 +1307,7 @@
               <w:rPr>
                 <w:rFonts w:eastAsiaTheme="minorEastAsia"/>
                 <w:noProof/>
-                <w:lang w:eastAsia="zh-CN"/>
+                <w:lang w:val="en-US" w:eastAsia="zh-CN"/>
               </w:rPr>
               <w:tab/>
             </w:r>
@@ -1337,7 +1337,7 @@
                 <w:noProof/>
                 <w:webHidden/>
               </w:rPr>
-              <w:instrText xml:space="preserve"> PAGEREF _Toc198300849 \h </w:instrText>
+              <w:instrText xml:space="preserve"> PAGEREF _Toc199943868 \h </w:instrText>
             </w:r>
             <w:r>
               <w:rPr>
@@ -1357,7 +1357,7 @@
                 <w:noProof/>
                 <w:webHidden/>
               </w:rPr>
-              <w:t>11</w:t>
+              <w:t>12</w:t>
             </w:r>
             <w:r>
               <w:rPr>
@@ -1378,10 +1378,10 @@
             <w:rPr>
               <w:rFonts w:eastAsiaTheme="minorEastAsia"/>
               <w:noProof/>
-              <w:lang w:eastAsia="zh-CN"/>
+              <w:lang w:val="en-US" w:eastAsia="zh-CN"/>
             </w:rPr>
           </w:pPr>
-          <w:hyperlink w:anchor="_Toc198300850" w:history="1">
+          <w:hyperlink w:anchor="_Toc199943869" w:history="1">
             <w:r>
               <w:rPr>
                 <w:rStyle w:val="Hyperlink"/>
@@ -1393,7 +1393,7 @@
               <w:rPr>
                 <w:rFonts w:eastAsiaTheme="minorEastAsia"/>
                 <w:noProof/>
-                <w:lang w:eastAsia="zh-CN"/>
+                <w:lang w:val="en-US" w:eastAsia="zh-CN"/>
               </w:rPr>
               <w:tab/>
             </w:r>
@@ -1402,7 +1402,21 @@
                 <w:rStyle w:val="Hyperlink"/>
                 <w:noProof/>
               </w:rPr>
-              <w:t>Discussion of Sweep Results (Key Findings)</w:t>
+              <w:t>CFD re</w:t>
+            </w:r>
+            <w:r>
+              <w:rPr>
+                <w:rStyle w:val="Hyperlink"/>
+                <w:noProof/>
+              </w:rPr>
+              <w:t>s</w:t>
+            </w:r>
+            <w:r>
+              <w:rPr>
+                <w:rStyle w:val="Hyperlink"/>
+                <w:noProof/>
+              </w:rPr>
+              <w:t>ults</w:t>
             </w:r>
             <w:r>
               <w:rPr>
@@ -1423,7 +1437,7 @@
                 <w:noProof/>
                 <w:webHidden/>
               </w:rPr>
-              <w:instrText xml:space="preserve"> PAGEREF _Toc198300850 \h </w:instrText>
+              <w:instrText xml:space="preserve"> PAGEREF _Toc199943869 \h </w:instrText>
             </w:r>
             <w:r>
               <w:rPr>
@@ -1443,7 +1457,93 @@
                 <w:noProof/>
                 <w:webHidden/>
               </w:rPr>
-              <w:t>13</w:t>
+              <w:t>15</w:t>
+            </w:r>
+            <w:r>
+              <w:rPr>
+                <w:noProof/>
+                <w:webHidden/>
+              </w:rPr>
+              <w:fldChar w:fldCharType="end"/>
+            </w:r>
+          </w:hyperlink>
+        </w:p>
+        <w:p>
+          <w:pPr>
+            <w:pStyle w:val="TOC2"/>
+            <w:tabs>
+              <w:tab w:val="left" w:pos="960"/>
+              <w:tab w:val="right" w:leader="dot" w:pos="9016"/>
+            </w:tabs>
+            <w:rPr>
+              <w:rFonts w:eastAsiaTheme="minorEastAsia"/>
+              <w:noProof/>
+              <w:lang w:val="en-US" w:eastAsia="zh-CN"/>
+            </w:rPr>
+          </w:pPr>
+          <w:hyperlink w:anchor="_Toc199943870" w:history="1">
+            <w:r>
+              <w:rPr>
+                <w:rStyle w:val="Hyperlink"/>
+                <w:noProof/>
+              </w:rPr>
+              <w:t>3.4.</w:t>
+            </w:r>
+            <w:r>
+              <w:rPr>
+                <w:rFonts w:eastAsiaTheme="minorEastAsia"/>
+                <w:noProof/>
+                <w:lang w:val="en-US" w:eastAsia="zh-CN"/>
+              </w:rPr>
+              <w:tab/>
+            </w:r>
+            <w:r>
+              <w:rPr>
+                <w:rStyle w:val="Hyperlink"/>
+                <w:noProof/>
+              </w:rPr>
+              <w:t>Discussion of Sweep Results (Key Findings)</w:t>
+            </w:r>
+            <w:r>
+              <w:rPr>
+                <w:noProof/>
+                <w:webHidden/>
+              </w:rPr>
+              <w:tab/>
+            </w:r>
+            <w:r>
+              <w:rPr>
+                <w:noProof/>
+                <w:webHidden/>
+              </w:rPr>
+              <w:fldChar w:fldCharType="begin"/>
+            </w:r>
+            <w:r>
+              <w:rPr>
+                <w:noProof/>
+                <w:webHidden/>
+              </w:rPr>
+              <w:instrText xml:space="preserve"> PAGEREF _Toc199943870 \h </w:instrText>
+            </w:r>
+            <w:r>
+              <w:rPr>
+                <w:noProof/>
+                <w:webHidden/>
+              </w:rPr>
+            </w:r>
+            <w:r>
+              <w:rPr>
+                <w:noProof/>
+                <w:webHidden/>
+              </w:rPr>
+              <w:fldChar w:fldCharType="separate"/>
+            </w:r>
+            <w:r>
+              <w:rPr>
+                <w:noProof/>
+                <w:webHidden/>
+              </w:rPr>
+              <w:t>16</w:t>
             </w:r>
             <w:r>
               <w:rPr>
@@ -1464,10 +1564,10 @@
             <w:rPr>
               <w:rFonts w:eastAsiaTheme="minorEastAsia"/>
               <w:noProof/>
-              <w:lang w:eastAsia="zh-CN"/>
+              <w:lang w:val="en-US" w:eastAsia="zh-CN"/>
             </w:rPr>
           </w:pPr>
-          <w:hyperlink w:anchor="_Toc198300851" w:history="1">
+          <w:hyperlink w:anchor="_Toc199943871" w:history="1">
             <w:r>
               <w:rPr>
                 <w:rStyle w:val="Hyperlink"/>
@@ -1479,7 +1579,7 @@
               <w:rPr>
                 <w:rFonts w:eastAsiaTheme="minorEastAsia"/>
                 <w:noProof/>
-                <w:lang w:eastAsia="zh-CN"/>
+                <w:lang w:val="en-US" w:eastAsia="zh-CN"/>
               </w:rPr>
               <w:tab/>
             </w:r>
@@ -1509,7 +1609,7 @@
                 <w:noProof/>
                 <w:webHidden/>
               </w:rPr>
-              <w:instrText xml:space="preserve"> PAGEREF _Toc198300851 \h </w:instrText>
+              <w:instrText xml:space="preserve"> PAGEREF _Toc199943871 \h </w:instrText>
             </w:r>
             <w:r>
               <w:rPr>
@@ -1529,7 +1629,7 @@
                 <w:noProof/>
                 <w:webHidden/>
               </w:rPr>
-              <w:t>14</w:t>
+              <w:t>17</w:t>
             </w:r>
             <w:r>
               <w:rPr>
@@ -1550,10 +1650,10 @@
             <w:rPr>
               <w:rFonts w:eastAsiaTheme="minorEastAsia"/>
               <w:noProof/>
-              <w:lang w:eastAsia="zh-CN"/>
+              <w:lang w:val="en-US" w:eastAsia="zh-CN"/>
             </w:rPr>
           </w:pPr>
-          <w:hyperlink w:anchor="_Toc198300852" w:history="1">
+          <w:hyperlink w:anchor="_Toc199943872" w:history="1">
             <w:r>
               <w:rPr>
                 <w:rStyle w:val="Hyperlink"/>
@@ -1565,7 +1665,7 @@
               <w:rPr>
                 <w:rFonts w:eastAsiaTheme="minorEastAsia"/>
                 <w:noProof/>
-                <w:lang w:eastAsia="zh-CN"/>
+                <w:lang w:val="en-US" w:eastAsia="zh-CN"/>
               </w:rPr>
               <w:tab/>
             </w:r>
@@ -1595,7 +1695,7 @@
                 <w:noProof/>
                 <w:webHidden/>
               </w:rPr>
-              <w:instrText xml:space="preserve"> PAGEREF _Toc198300852 \h </w:instrText>
+              <w:instrText xml:space="preserve"> PAGEREF _Toc199943872 \h </w:instrText>
             </w:r>
             <w:r>
               <w:rPr>
@@ -1615,7 +1715,7 @@
                 <w:noProof/>
                 <w:webHidden/>
               </w:rPr>
-              <w:t>15</w:t>
+              <w:t>18</w:t>
             </w:r>
             <w:r>
               <w:rPr>
@@ -1636,22 +1736,22 @@
             <w:rPr>
               <w:rFonts w:eastAsiaTheme="minorEastAsia"/>
               <w:noProof/>
-              <w:lang w:eastAsia="zh-CN"/>
+              <w:lang w:val="en-US" w:eastAsia="zh-CN"/>
             </w:rPr>
           </w:pPr>
-          <w:hyperlink w:anchor="_Toc198300853" w:history="1">
+          <w:hyperlink w:anchor="_Toc199943873" w:history="1">
             <w:r>
               <w:rPr>
                 <w:rStyle w:val="Hyperlink"/>
                 <w:noProof/>
               </w:rPr>
-              <w:t>6.</w:t>
+              <w:t>4.</w:t>
             </w:r>
             <w:r>
               <w:rPr>
                 <w:rFonts w:eastAsiaTheme="minorEastAsia"/>
                 <w:noProof/>
-                <w:lang w:eastAsia="zh-CN"/>
+                <w:lang w:val="en-US" w:eastAsia="zh-CN"/>
               </w:rPr>
               <w:tab/>
             </w:r>
@@ -1681,7 +1781,7 @@
                 <w:noProof/>
                 <w:webHidden/>
               </w:rPr>
-              <w:instrText xml:space="preserve"> PAGEREF _Toc198300853 \h </w:instrText>
+              <w:instrText xml:space="preserve"> PAGEREF _Toc199943873 \h </w:instrText>
             </w:r>
             <w:r>
               <w:rPr>
@@ -1701,7 +1801,7 @@
                 <w:noProof/>
                 <w:webHidden/>
               </w:rPr>
-              <w:t>16</w:t>
+              <w:t>19</w:t>
             </w:r>
             <w:r>
               <w:rPr>
@@ -1722,22 +1822,22 @@
             <w:rPr>
               <w:rFonts w:eastAsiaTheme="minorEastAsia"/>
               <w:noProof/>
-              <w:lang w:eastAsia="zh-CN"/>
+              <w:lang w:val="en-US" w:eastAsia="zh-CN"/>
             </w:rPr>
           </w:pPr>
-          <w:hyperlink w:anchor="_Toc198300854" w:history="1">
+          <w:hyperlink w:anchor="_Toc199943874" w:history="1">
             <w:r>
               <w:rPr>
                 <w:rStyle w:val="Hyperlink"/>
                 <w:noProof/>
               </w:rPr>
-              <w:t>6.1.</w:t>
+              <w:t>4.1.</w:t>
             </w:r>
             <w:r>
               <w:rPr>
                 <w:rFonts w:eastAsiaTheme="minorEastAsia"/>
                 <w:noProof/>
-                <w:lang w:eastAsia="zh-CN"/>
+                <w:lang w:val="en-US" w:eastAsia="zh-CN"/>
               </w:rPr>
               <w:tab/>
             </w:r>
@@ -1767,7 +1867,7 @@
                 <w:noProof/>
                 <w:webHidden/>
               </w:rPr>
-              <w:instrText xml:space="preserve"> PAGEREF _Toc198300854 \h </w:instrText>
+              <w:instrText xml:space="preserve"> PAGEREF _Toc199943874 \h </w:instrText>
             </w:r>
             <w:r>
               <w:rPr>
@@ -1787,7 +1887,93 @@
                 <w:noProof/>
                 <w:webHidden/>
               </w:rPr>
-              <w:t>16</w:t>
+              <w:t>19</w:t>
+            </w:r>
+            <w:r>
+              <w:rPr>
+                <w:noProof/>
+                <w:webHidden/>
+              </w:rPr>
+              <w:fldChar w:fldCharType="end"/>
+            </w:r>
+          </w:hyperlink>
+        </w:p>
+        <w:p>
+          <w:pPr>
+            <w:pStyle w:val="TOC2"/>
+            <w:tabs>
+              <w:tab w:val="left" w:pos="960"/>
+              <w:tab w:val="right" w:leader="dot" w:pos="9016"/>
+            </w:tabs>
+            <w:rPr>
+              <w:rFonts w:eastAsiaTheme="minorEastAsia"/>
+              <w:noProof/>
+              <w:lang w:val="en-US" w:eastAsia="zh-CN"/>
+            </w:rPr>
+          </w:pPr>
+          <w:hyperlink w:anchor="_Toc199943875" w:history="1">
+            <w:r>
+              <w:rPr>
+                <w:rStyle w:val="Hyperlink"/>
+                <w:noProof/>
+              </w:rPr>
+              <w:t>4.2.</w:t>
+            </w:r>
+            <w:r>
+              <w:rPr>
+                <w:rFonts w:eastAsiaTheme="minorEastAsia"/>
+                <w:noProof/>
+                <w:lang w:val="en-US" w:eastAsia="zh-CN"/>
+              </w:rPr>
+              <w:tab/>
+            </w:r>
+            <w:r>
+              <w:rPr>
+                <w:rStyle w:val="Hyperlink"/>
+                <w:noProof/>
+              </w:rPr>
+              <w:t>Decision Matrix</w:t>
+            </w:r>
+            <w:r>
+              <w:rPr>
+                <w:noProof/>
+                <w:webHidden/>
+              </w:rPr>
+              <w:tab/>
+            </w:r>
+            <w:r>
+              <w:rPr>
+                <w:noProof/>
+                <w:webHidden/>
+              </w:rPr>
+              <w:fldChar w:fldCharType="begin"/>
+            </w:r>
+            <w:r>
+              <w:rPr>
+                <w:noProof/>
+                <w:webHidden/>
+              </w:rPr>
+              <w:instrText xml:space="preserve"> PAGEREF _Toc199943875 \h </w:instrText>
+            </w:r>
+            <w:r>
+              <w:rPr>
+                <w:noProof/>
+                <w:webHidden/>
+              </w:rPr>
+            </w:r>
+            <w:r>
+              <w:rPr>
+                <w:noProof/>
+                <w:webHidden/>
+              </w:rPr>
+              <w:fldChar w:fldCharType="separate"/>
+            </w:r>
+            <w:r>
+              <w:rPr>
+                <w:noProof/>
+                <w:webHidden/>
+              </w:rPr>
+              <w:t>20</w:t>
             </w:r>
             <w:r>
               <w:rPr>
@@ -1819,9 +2005,8 @@
         </w:numPr>
         <w:ind w:left="284"/>
       </w:pPr>
-      <w:bookmarkStart w:id="1" w:name="_Toc198300836"/>
-      <w:r>
-        <w:lastRenderedPageBreak/>
+      <w:bookmarkStart w:id="1" w:name="_Toc199943855"/>
+      <w:r>
         <w:t>Introduction</w:t>
       </w:r>
       <w:bookmarkEnd w:id="1"/>
@@ -1835,7 +2020,7 @@
         </w:numPr>
         <w:ind w:left="709"/>
       </w:pPr>
-      <w:bookmarkStart w:id="2" w:name="_Toc198300837"/>
+      <w:bookmarkStart w:id="2" w:name="_Toc199943856"/>
       <w:r>
         <w:t>Purpose</w:t>
       </w:r>
@@ -1883,7 +2068,7 @@
         </w:numPr>
         <w:ind w:left="709"/>
       </w:pPr>
-      <w:bookmarkStart w:id="3" w:name="_Toc198300838"/>
+      <w:bookmarkStart w:id="3" w:name="_Toc199943857"/>
       <w:r>
         <w:t xml:space="preserve">Design Scope and </w:t>
       </w:r>
@@ -1995,7 +2180,7 @@
         </w:numPr>
         <w:ind w:left="709"/>
       </w:pPr>
-      <w:bookmarkStart w:id="4" w:name="_Toc198300839"/>
+      <w:bookmarkStart w:id="4" w:name="_Toc199943858"/>
       <w:r>
         <w:t>Background/Previous research</w:t>
       </w:r>
@@ -2020,7 +2205,7 @@
         </w:numPr>
         <w:ind w:left="284"/>
       </w:pPr>
-      <w:bookmarkStart w:id="5" w:name="_Toc198300840"/>
+      <w:bookmarkStart w:id="5" w:name="_Toc199943859"/>
       <w:r>
         <w:lastRenderedPageBreak/>
         <w:t>Method</w:t>
@@ -2039,7 +2224,7 @@
         </w:numPr>
         <w:ind w:left="709"/>
       </w:pPr>
-      <w:bookmarkStart w:id="6" w:name="_Toc198300841"/>
+      <w:bookmarkStart w:id="6" w:name="_Toc199943860"/>
       <w:r>
         <w:t>Design Approach</w:t>
       </w:r>
@@ -2235,7 +2420,7 @@
         </w:numPr>
         <w:ind w:left="709"/>
       </w:pPr>
-      <w:bookmarkStart w:id="7" w:name="_Toc198300842"/>
+      <w:bookmarkStart w:id="7" w:name="_Toc199943861"/>
       <w:r>
         <w:t>Assumptions</w:t>
       </w:r>
@@ -2329,6 +2514,20 @@
       </w:pPr>
       <w:r>
         <w:t>Flow Model: One-dimensional, steady, compressible, isentropic flow of a calorically perfect gas.</w:t>
+      </w:r>
+    </w:p>
+    <w:p>
+      <w:pPr>
+        <w:numPr>
+          <w:ilvl w:val="1"/>
+          <w:numId w:val="7"/>
+        </w:numPr>
+      </w:pPr>
+      <w:r>
+        <w:t xml:space="preserve">Renault Number </w:t>
+      </w:r>
+      <w:r>
+        <w:t>(Re) is insignificant and can be omitted from the calculations</w:t>
       </w:r>
     </w:p>
     <w:p>
@@ -2445,6 +2644,7 @@
           <w:b/>
           <w:bCs/>
         </w:rPr>
+        <w:lastRenderedPageBreak/>
         <w:t>Geometric Inputs (Baseline for Mode 1; R</w:t>
       </w:r>
       <w:r>
@@ -2507,7 +2707,13 @@
         <w:t>​</w:t>
       </w:r>
       <w:r>
-        <w:t>): 0.005 m (baseline)</w:t>
+        <w:t>): 0.00</w:t>
+      </w:r>
+      <w:r>
+        <w:t>6</w:t>
+      </w:r>
+      <w:r>
+        <w:t xml:space="preserve"> m (baseline)</w:t>
       </w:r>
     </w:p>
     <w:p>
@@ -2518,7 +2724,6 @@
         </w:numPr>
       </w:pPr>
       <w:r>
-        <w:lastRenderedPageBreak/>
         <w:t>Chamber Radius (R</w:t>
       </w:r>
       <w:r>
@@ -2619,7 +2824,7 @@
         </w:numPr>
         <w:ind w:left="709"/>
       </w:pPr>
-      <w:bookmarkStart w:id="8" w:name="_Toc198300843"/>
+      <w:bookmarkStart w:id="8" w:name="_Toc199943862"/>
       <w:r>
         <w:t>Computational Process and Key Equations</w:t>
       </w:r>
@@ -3769,6 +3974,7 @@
         </w:rPr>
       </w:pPr>
       <w:r>
+        <w:lastRenderedPageBreak/>
         <w:t xml:space="preserve">Pressure Ratio: </w:t>
       </w:r>
       <m:oMath>
@@ -4117,7 +4323,6 @@
           <w:b/>
           <w:bCs/>
         </w:rPr>
-        <w:lastRenderedPageBreak/>
         <w:t>Conical Nozzle Performance:</w:t>
       </w:r>
       <w:r>
@@ -5998,6 +6203,538 @@
         </w:numPr>
       </w:pPr>
       <w:r>
+        <w:rPr>
+          <w:b/>
+          <w:bCs/>
+        </w:rPr>
+        <w:lastRenderedPageBreak/>
+        <w:t>Bell Nozzle Geometry</w:t>
+      </w:r>
+      <w:r>
+        <w:rPr>
+          <w:b/>
+          <w:bCs/>
+        </w:rPr>
+        <w:t xml:space="preserve"> for CAD models</w:t>
+      </w:r>
+      <w:r>
+        <w:rPr>
+          <w:b/>
+          <w:bCs/>
+        </w:rPr>
+        <w:t xml:space="preserve">: </w:t>
+      </w:r>
+      <w:r>
+        <w:t xml:space="preserve">calculating exit radius and </w:t>
+      </w:r>
+      <w:r>
+        <w:t>nozzle length</w:t>
+      </w:r>
+    </w:p>
+    <w:p>
+      <w:pPr>
+        <w:rPr>
+          <w:rFonts w:eastAsiaTheme="minorEastAsia"/>
+        </w:rPr>
+      </w:pPr>
+      <m:oMathPara>
+        <m:oMath>
+          <m:sSub>
+            <m:sSubPr>
+              <m:ctrlPr>
+                <w:rPr>
+                  <w:rFonts w:ascii="Cambria Math" w:hAnsi="Cambria Math"/>
+                  <w:i/>
+                </w:rPr>
+              </m:ctrlPr>
+            </m:sSubPr>
+            <m:e>
+              <m:r>
+                <w:rPr>
+                  <w:rFonts w:ascii="Cambria Math" w:hAnsi="Cambria Math"/>
+                </w:rPr>
+                <m:t>R</m:t>
+              </m:r>
+            </m:e>
+            <m:sub>
+              <m:r>
+                <w:rPr>
+                  <w:rFonts w:ascii="Cambria Math" w:hAnsi="Cambria Math"/>
+                </w:rPr>
+                <m:t>exit</m:t>
+              </m:r>
+            </m:sub>
+          </m:sSub>
+          <m:r>
+            <w:rPr>
+              <w:rFonts w:ascii="Cambria Math" w:hAnsi="Cambria Math"/>
+            </w:rPr>
+            <m:t>=</m:t>
+          </m:r>
+          <m:rad>
+            <m:radPr>
+              <m:degHide m:val="1"/>
+              <m:ctrlPr>
+                <w:rPr>
+                  <w:rFonts w:ascii="Cambria Math" w:hAnsi="Cambria Math"/>
+                  <w:i/>
+                </w:rPr>
+              </m:ctrlPr>
+            </m:radPr>
+            <m:deg/>
+            <m:e>
+              <m:f>
+                <m:fPr>
+                  <m:ctrlPr>
+                    <w:rPr>
+                      <w:rFonts w:ascii="Cambria Math" w:hAnsi="Cambria Math"/>
+                      <w:i/>
+                    </w:rPr>
+                  </m:ctrlPr>
+                </m:fPr>
+                <m:num>
+                  <m:r>
+                    <w:rPr>
+                      <w:rFonts w:ascii="Cambria Math" w:hAnsi="Cambria Math"/>
+                    </w:rPr>
+                    <m:t>π</m:t>
+                  </m:r>
+                  <m:sSubSup>
+                    <m:sSubSupPr>
+                      <m:ctrlPr>
+                        <w:rPr>
+                          <w:rFonts w:ascii="Cambria Math" w:hAnsi="Cambria Math"/>
+                          <w:i/>
+                        </w:rPr>
+                      </m:ctrlPr>
+                    </m:sSubSupPr>
+                    <m:e>
+                      <m:r>
+                        <w:rPr>
+                          <w:rFonts w:ascii="Cambria Math" w:hAnsi="Cambria Math"/>
+                        </w:rPr>
+                        <m:t>r</m:t>
+                      </m:r>
+                    </m:e>
+                    <m:sub>
+                      <m:r>
+                        <w:rPr>
+                          <w:rFonts w:ascii="Cambria Math" w:hAnsi="Cambria Math"/>
+                        </w:rPr>
+                        <m:t>throat</m:t>
+                      </m:r>
+                    </m:sub>
+                    <m:sup>
+                      <m:r>
+                        <w:rPr>
+                          <w:rFonts w:ascii="Cambria Math" w:hAnsi="Cambria Math"/>
+                        </w:rPr>
+                        <m:t>2</m:t>
+                      </m:r>
+                    </m:sup>
+                  </m:sSubSup>
+                  <m:r>
+                    <w:rPr>
+                      <w:rFonts w:ascii="Cambria Math" w:hAnsi="Cambria Math"/>
+                    </w:rPr>
+                    <m:t>×</m:t>
+                  </m:r>
+                  <m:f>
+                    <m:fPr>
+                      <m:ctrlPr>
+                        <w:rPr>
+                          <w:rFonts w:ascii="Cambria Math" w:hAnsi="Cambria Math"/>
+                          <w:i/>
+                        </w:rPr>
+                      </m:ctrlPr>
+                    </m:fPr>
+                    <m:num>
+                      <m:sSub>
+                        <m:sSubPr>
+                          <m:ctrlPr>
+                            <w:rPr>
+                              <w:rFonts w:ascii="Cambria Math" w:hAnsi="Cambria Math"/>
+                              <w:i/>
+                            </w:rPr>
+                          </m:ctrlPr>
+                        </m:sSubPr>
+                        <m:e>
+                          <m:r>
+                            <w:rPr>
+                              <w:rFonts w:ascii="Cambria Math" w:hAnsi="Cambria Math"/>
+                            </w:rPr>
+                            <m:t>A</m:t>
+                          </m:r>
+                        </m:e>
+                        <m:sub>
+                          <m:r>
+                            <w:rPr>
+                              <w:rFonts w:ascii="Cambria Math" w:hAnsi="Cambria Math"/>
+                            </w:rPr>
+                            <m:t>e</m:t>
+                          </m:r>
+                        </m:sub>
+                      </m:sSub>
+                    </m:num>
+                    <m:den>
+                      <m:sSub>
+                        <m:sSubPr>
+                          <m:ctrlPr>
+                            <w:rPr>
+                              <w:rFonts w:ascii="Cambria Math" w:hAnsi="Cambria Math"/>
+                              <w:i/>
+                            </w:rPr>
+                          </m:ctrlPr>
+                        </m:sSubPr>
+                        <m:e>
+                          <m:r>
+                            <w:rPr>
+                              <w:rFonts w:ascii="Cambria Math" w:hAnsi="Cambria Math"/>
+                            </w:rPr>
+                            <m:t>A</m:t>
+                          </m:r>
+                        </m:e>
+                        <m:sub>
+                          <m:r>
+                            <w:rPr>
+                              <w:rFonts w:ascii="Cambria Math" w:hAnsi="Cambria Math"/>
+                            </w:rPr>
+                            <m:t>t</m:t>
+                          </m:r>
+                        </m:sub>
+                      </m:sSub>
+                    </m:den>
+                  </m:f>
+                </m:num>
+                <m:den>
+                  <m:r>
+                    <w:rPr>
+                      <w:rFonts w:ascii="Cambria Math" w:hAnsi="Cambria Math"/>
+                    </w:rPr>
+                    <m:t>π</m:t>
+                  </m:r>
+                </m:den>
+              </m:f>
+            </m:e>
+          </m:rad>
+        </m:oMath>
+      </m:oMathPara>
+    </w:p>
+    <w:p>
+      <w:pPr>
+        <w:rPr>
+          <w:rFonts w:eastAsiaTheme="minorEastAsia"/>
+        </w:rPr>
+      </w:pPr>
+      <m:oMathPara>
+        <m:oMath>
+          <m:sSub>
+            <m:sSubPr>
+              <m:ctrlPr>
+                <w:rPr>
+                  <w:rFonts w:ascii="Cambria Math" w:hAnsi="Cambria Math"/>
+                  <w:i/>
+                </w:rPr>
+              </m:ctrlPr>
+            </m:sSubPr>
+            <m:e>
+              <m:r>
+                <w:rPr>
+                  <w:rFonts w:ascii="Cambria Math" w:hAnsi="Cambria Math"/>
+                </w:rPr>
+                <m:t>R</m:t>
+              </m:r>
+            </m:e>
+            <m:sub>
+              <m:r>
+                <w:rPr>
+                  <w:rFonts w:ascii="Cambria Math" w:hAnsi="Cambria Math"/>
+                </w:rPr>
+                <m:t>exit</m:t>
+              </m:r>
+            </m:sub>
+          </m:sSub>
+          <m:r>
+            <w:rPr>
+              <w:rFonts w:ascii="Cambria Math" w:hAnsi="Cambria Math"/>
+            </w:rPr>
+            <m:t>=</m:t>
+          </m:r>
+          <m:sSub>
+            <m:sSubPr>
+              <m:ctrlPr>
+                <w:rPr>
+                  <w:rFonts w:ascii="Cambria Math" w:hAnsi="Cambria Math"/>
+                  <w:i/>
+                </w:rPr>
+              </m:ctrlPr>
+            </m:sSubPr>
+            <m:e>
+              <m:r>
+                <w:rPr>
+                  <w:rFonts w:ascii="Cambria Math" w:hAnsi="Cambria Math"/>
+                </w:rPr>
+                <m:t>r</m:t>
+              </m:r>
+            </m:e>
+            <m:sub>
+              <m:r>
+                <w:rPr>
+                  <w:rFonts w:ascii="Cambria Math" w:hAnsi="Cambria Math"/>
+                </w:rPr>
+                <m:t>throat</m:t>
+              </m:r>
+            </m:sub>
+          </m:sSub>
+          <m:rad>
+            <m:radPr>
+              <m:degHide m:val="1"/>
+              <m:ctrlPr>
+                <w:rPr>
+                  <w:rFonts w:ascii="Cambria Math" w:hAnsi="Cambria Math"/>
+                  <w:i/>
+                </w:rPr>
+              </m:ctrlPr>
+            </m:radPr>
+            <m:deg/>
+            <m:e>
+              <m:f>
+                <m:fPr>
+                  <m:ctrlPr>
+                    <w:rPr>
+                      <w:rFonts w:ascii="Cambria Math" w:hAnsi="Cambria Math"/>
+                      <w:i/>
+                    </w:rPr>
+                  </m:ctrlPr>
+                </m:fPr>
+                <m:num>
+                  <m:sSub>
+                    <m:sSubPr>
+                      <m:ctrlPr>
+                        <w:rPr>
+                          <w:rFonts w:ascii="Cambria Math" w:hAnsi="Cambria Math"/>
+                          <w:i/>
+                        </w:rPr>
+                      </m:ctrlPr>
+                    </m:sSubPr>
+                    <m:e>
+                      <m:r>
+                        <w:rPr>
+                          <w:rFonts w:ascii="Cambria Math" w:hAnsi="Cambria Math"/>
+                        </w:rPr>
+                        <m:t>A</m:t>
+                      </m:r>
+                    </m:e>
+                    <m:sub>
+                      <m:r>
+                        <w:rPr>
+                          <w:rFonts w:ascii="Cambria Math" w:hAnsi="Cambria Math"/>
+                        </w:rPr>
+                        <m:t>e</m:t>
+                      </m:r>
+                    </m:sub>
+                  </m:sSub>
+                </m:num>
+                <m:den>
+                  <m:sSub>
+                    <m:sSubPr>
+                      <m:ctrlPr>
+                        <w:rPr>
+                          <w:rFonts w:ascii="Cambria Math" w:hAnsi="Cambria Math"/>
+                          <w:i/>
+                        </w:rPr>
+                      </m:ctrlPr>
+                    </m:sSubPr>
+                    <m:e>
+                      <m:r>
+                        <w:rPr>
+                          <w:rFonts w:ascii="Cambria Math" w:hAnsi="Cambria Math"/>
+                        </w:rPr>
+                        <m:t>A</m:t>
+                      </m:r>
+                    </m:e>
+                    <m:sub>
+                      <m:r>
+                        <w:rPr>
+                          <w:rFonts w:ascii="Cambria Math" w:hAnsi="Cambria Math"/>
+                        </w:rPr>
+                        <m:t>t</m:t>
+                      </m:r>
+                    </m:sub>
+                  </m:sSub>
+                </m:den>
+              </m:f>
+            </m:e>
+          </m:rad>
+        </m:oMath>
+      </m:oMathPara>
+    </w:p>
+    <w:p>
+      <m:oMathPara>
+        <m:oMath>
+          <m:r>
+            <w:rPr>
+              <w:rFonts w:ascii="Cambria Math" w:hAnsi="Cambria Math"/>
+            </w:rPr>
+            <m:t>Lengt</m:t>
+          </m:r>
+          <m:sSub>
+            <m:sSubPr>
+              <m:ctrlPr>
+                <w:rPr>
+                  <w:rFonts w:ascii="Cambria Math" w:hAnsi="Cambria Math"/>
+                  <w:i/>
+                </w:rPr>
+              </m:ctrlPr>
+            </m:sSubPr>
+            <m:e>
+              <m:r>
+                <w:rPr>
+                  <w:rFonts w:ascii="Cambria Math" w:hAnsi="Cambria Math"/>
+                </w:rPr>
+                <m:t>h</m:t>
+              </m:r>
+            </m:e>
+            <m:sub>
+              <m:r>
+                <w:rPr>
+                  <w:rFonts w:ascii="Cambria Math" w:hAnsi="Cambria Math"/>
+                </w:rPr>
+                <m:t>div</m:t>
+              </m:r>
+            </m:sub>
+          </m:sSub>
+          <m:r>
+            <w:rPr>
+              <w:rFonts w:ascii="Cambria Math" w:hAnsi="Cambria Math"/>
+            </w:rPr>
+            <m:t>=</m:t>
+          </m:r>
+          <m:f>
+            <m:fPr>
+              <m:ctrlPr>
+                <w:rPr>
+                  <w:rFonts w:ascii="Cambria Math" w:hAnsi="Cambria Math"/>
+                  <w:i/>
+                </w:rPr>
+              </m:ctrlPr>
+            </m:fPr>
+            <m:num>
+              <m:sSub>
+                <m:sSubPr>
+                  <m:ctrlPr>
+                    <w:rPr>
+                      <w:rFonts w:ascii="Cambria Math" w:hAnsi="Cambria Math"/>
+                      <w:i/>
+                    </w:rPr>
+                  </m:ctrlPr>
+                </m:sSubPr>
+                <m:e>
+                  <m:r>
+                    <w:rPr>
+                      <w:rFonts w:ascii="Cambria Math" w:hAnsi="Cambria Math"/>
+                    </w:rPr>
+                    <m:t>R</m:t>
+                  </m:r>
+                </m:e>
+                <m:sub>
+                  <m:r>
+                    <w:rPr>
+                      <w:rFonts w:ascii="Cambria Math" w:hAnsi="Cambria Math"/>
+                    </w:rPr>
+                    <m:t>exit</m:t>
+                  </m:r>
+                </m:sub>
+              </m:sSub>
+              <m:r>
+                <w:rPr>
+                  <w:rFonts w:ascii="Cambria Math" w:hAnsi="Cambria Math"/>
+                </w:rPr>
+                <m:t>-</m:t>
+              </m:r>
+              <m:sSub>
+                <m:sSubPr>
+                  <m:ctrlPr>
+                    <w:rPr>
+                      <w:rFonts w:ascii="Cambria Math" w:hAnsi="Cambria Math"/>
+                      <w:i/>
+                    </w:rPr>
+                  </m:ctrlPr>
+                </m:sSubPr>
+                <m:e>
+                  <m:r>
+                    <w:rPr>
+                      <w:rFonts w:ascii="Cambria Math" w:hAnsi="Cambria Math"/>
+                    </w:rPr>
+                    <m:t>R</m:t>
+                  </m:r>
+                </m:e>
+                <m:sub>
+                  <m:r>
+                    <w:rPr>
+                      <w:rFonts w:ascii="Cambria Math" w:hAnsi="Cambria Math"/>
+                    </w:rPr>
+                    <m:t>throat</m:t>
+                  </m:r>
+                </m:sub>
+              </m:sSub>
+            </m:num>
+            <m:den>
+              <m:func>
+                <m:funcPr>
+                  <m:ctrlPr>
+                    <w:rPr>
+                      <w:rFonts w:ascii="Cambria Math" w:hAnsi="Cambria Math"/>
+                      <w:i/>
+                    </w:rPr>
+                  </m:ctrlPr>
+                </m:funcPr>
+                <m:fName>
+                  <m:r>
+                    <m:rPr>
+                      <m:sty m:val="p"/>
+                    </m:rPr>
+                    <w:rPr>
+                      <w:rFonts w:ascii="Cambria Math" w:hAnsi="Cambria Math"/>
+                    </w:rPr>
+                    <m:t>tan</m:t>
+                  </m:r>
+                </m:fName>
+                <m:e>
+                  <m:d>
+                    <m:dPr>
+                      <m:ctrlPr>
+                        <w:rPr>
+                          <w:rFonts w:ascii="Cambria Math" w:hAnsi="Cambria Math"/>
+                          <w:i/>
+                        </w:rPr>
+                      </m:ctrlPr>
+                    </m:dPr>
+                    <m:e>
+                      <m:r>
+                        <w:rPr>
+                          <w:rFonts w:ascii="Cambria Math" w:hAnsi="Cambria Math"/>
+                        </w:rPr>
+                        <m:t>30°</m:t>
+                      </m:r>
+                    </m:e>
+                  </m:d>
+                </m:e>
+              </m:func>
+            </m:den>
+          </m:f>
+        </m:oMath>
+      </m:oMathPara>
+    </w:p>
+    <w:p>
+      <w:pPr>
+        <w:pStyle w:val="ListParagraph"/>
+        <w:numPr>
+          <w:ilvl w:val="0"/>
+          <w:numId w:val="8"/>
+        </w:numPr>
+      </w:pPr>
+      <w:r>
         <w:t xml:space="preserve">Then, </w:t>
       </w:r>
       <w:r>
@@ -6108,7 +6845,6 @@
         <w:rPr>
           <w:rFonts w:eastAsiaTheme="minorEastAsia"/>
         </w:rPr>
-        <w:lastRenderedPageBreak/>
         <w:t>Calculating</w:t>
       </w:r>
       <w:r>
@@ -6304,7 +7040,7 @@
         </w:numPr>
         <w:ind w:left="709"/>
       </w:pPr>
-      <w:bookmarkStart w:id="9" w:name="_Toc198300844"/>
+      <w:bookmarkStart w:id="9" w:name="_Toc199943863"/>
       <w:r>
         <w:lastRenderedPageBreak/>
         <w:t>Software</w:t>
@@ -6372,7 +7108,7 @@
         </w:numPr>
         <w:ind w:left="1134"/>
       </w:pPr>
-      <w:bookmarkStart w:id="10" w:name="_Toc198300845"/>
+      <w:bookmarkStart w:id="10" w:name="_Toc199943864"/>
       <w:r>
         <w:t>Mode 1</w:t>
       </w:r>
@@ -6517,7 +7253,7 @@
         </w:numPr>
         <w:ind w:left="1134"/>
       </w:pPr>
-      <w:bookmarkStart w:id="11" w:name="_Toc198300846"/>
+      <w:bookmarkStart w:id="11" w:name="_Toc199943865"/>
       <w:r>
         <w:lastRenderedPageBreak/>
         <w:t>Mode 2</w:t>
@@ -6627,7 +7363,7 @@
         </w:numPr>
         <w:ind w:left="284"/>
       </w:pPr>
-      <w:bookmarkStart w:id="12" w:name="_Toc198300847"/>
+      <w:bookmarkStart w:id="12" w:name="_Toc199943866"/>
       <w:r>
         <w:lastRenderedPageBreak/>
         <w:t xml:space="preserve">Results </w:t>
@@ -6652,7 +7388,7 @@
         </w:numPr>
         <w:ind w:left="709"/>
       </w:pPr>
-      <w:bookmarkStart w:id="13" w:name="_Toc198300848"/>
+      <w:bookmarkStart w:id="13" w:name="_Toc199943867"/>
       <w:r>
         <w:t>Mode 1: Baseline Design Analysis</w:t>
       </w:r>
@@ -6695,7 +7431,16 @@
         <w:t>​</w:t>
       </w:r>
       <w:r>
-        <w:t>=5mm,</w:t>
+        <w:t>=</w:t>
+      </w:r>
+      <w:r>
+        <w:t>0.</w:t>
+      </w:r>
+      <w:r>
+        <w:t>6</w:t>
+      </w:r>
+      <w:r>
+        <w:t>mm,</w:t>
       </w:r>
       <w:r>
         <w:t xml:space="preserve"> </w:t>
@@ -6781,7 +7526,13 @@
         <w:t>​</w:t>
       </w:r>
       <w:r>
-        <w:t xml:space="preserve">): 7.000 </w:t>
+        <w:t xml:space="preserve">): </w:t>
+      </w:r>
+      <w:r>
+        <w:t>10</w:t>
+      </w:r>
+      <w:r>
+        <w:t xml:space="preserve">.000 </w:t>
       </w:r>
     </w:p>
     <w:p>
@@ -6872,7 +7623,10 @@
         <w:t>​</w:t>
       </w:r>
       <w:r>
-        <w:t>): 24.11316</w:t>
+        <w:t xml:space="preserve">): </w:t>
+      </w:r>
+      <w:r>
+        <w:t>66.19265</w:t>
       </w:r>
     </w:p>
     <w:p>
@@ -6892,7 +7646,16 @@
         <w:t>​</w:t>
       </w:r>
       <w:r>
-        <w:t>): 0.53344 Pa</w:t>
+        <w:t xml:space="preserve">): </w:t>
+      </w:r>
+      <w:r>
+        <w:t>0.09665</w:t>
+      </w:r>
+      <w:r>
+        <w:t xml:space="preserve"> </w:t>
+      </w:r>
+      <w:r>
+        <w:t>Pa</w:t>
       </w:r>
     </w:p>
     <w:p>
@@ -6912,7 +7675,13 @@
         <w:t>​</w:t>
       </w:r>
       <w:r>
-        <w:t>): 72.97 mm</w:t>
+        <w:t xml:space="preserve">): </w:t>
+      </w:r>
+      <w:r>
+        <w:t>15.98</w:t>
+      </w:r>
+      <w:r>
+        <w:t xml:space="preserve"> mm</w:t>
       </w:r>
     </w:p>
     <w:p>
@@ -6932,7 +7701,13 @@
         <w:t xml:space="preserve">: </w:t>
       </w:r>
       <w:r>
-        <w:t>58.38</w:t>
+        <w:t>12</w:t>
+      </w:r>
+      <w:r>
+        <w:t>.</w:t>
+      </w:r>
+      <w:r>
+        <w:t>78</w:t>
       </w:r>
       <w:r>
         <w:t xml:space="preserve"> mm</w:t>
@@ -6955,10 +7730,16 @@
         <w:t xml:space="preserve"> </w:t>
       </w:r>
       <w:r>
-        <w:t>93.64 g. (</w:t>
-      </w:r>
-      <w:r>
-        <w:t xml:space="preserve">Aluminium Alloy 6061) </w:t>
+        <w:t>2.03</w:t>
+      </w:r>
+      <w:r>
+        <w:t xml:space="preserve"> g. (</w:t>
+      </w:r>
+      <w:r>
+        <w:t>Aluminiu</w:t>
+      </w:r>
+      <w:r>
+        <w:t xml:space="preserve">m Alloy 6061) </w:t>
       </w:r>
     </w:p>
     <w:p>
@@ -7024,7 +7805,10 @@
         </w:numPr>
       </w:pPr>
       <w:r>
-        <w:t>Subsonic Exit: 0.99857</w:t>
+        <w:t xml:space="preserve">Subsonic Exit: </w:t>
+      </w:r>
+      <w:r>
+        <w:t>0.99981</w:t>
       </w:r>
     </w:p>
     <w:p>
@@ -7035,7 +7819,10 @@
         </w:numPr>
       </w:pPr>
       <w:r>
-        <w:t>Normal Shock at Exit: 0.04882</w:t>
+        <w:t xml:space="preserve">Normal Shock at Exit: </w:t>
+      </w:r>
+      <w:r>
+        <w:t>0.01809</w:t>
       </w:r>
     </w:p>
     <w:p>
@@ -7064,7 +7851,10 @@
         <w:t>​</w:t>
       </w:r>
       <w:r>
-        <w:t>): 0.00080</w:t>
+        <w:t xml:space="preserve">): </w:t>
+      </w:r>
+      <w:r>
+        <w:t>0.00014</w:t>
       </w:r>
     </w:p>
     <w:p>
@@ -7167,7 +7957,16 @@
         <w:t>​</w:t>
       </w:r>
       <w:r>
-        <w:t>): 542.30 m/s</w:t>
+        <w:t xml:space="preserve">): </w:t>
+      </w:r>
+      <w:r>
+        <w:t>550.46</w:t>
+      </w:r>
+      <w:r>
+        <w:t xml:space="preserve"> </w:t>
+      </w:r>
+      <w:r>
+        <w:t>m/s</w:t>
       </w:r>
     </w:p>
     <w:p>
@@ -7213,7 +8012,13 @@
         </w:numPr>
       </w:pPr>
       <w:r>
-        <w:t>Thrust (F): 0.08351 N</w:t>
+        <w:t xml:space="preserve">Thrust (F): </w:t>
+      </w:r>
+      <w:r>
+        <w:t>0.00121</w:t>
+      </w:r>
+      <w:r>
+        <w:t xml:space="preserve"> N</w:t>
       </w:r>
     </w:p>
     <w:p>
@@ -7261,7 +8066,10 @@
         <w:t>​</w:t>
       </w:r>
       <w:r>
-        <w:t>): 1.59497</w:t>
+        <w:t xml:space="preserve">): </w:t>
+      </w:r>
+      <w:r>
+        <w:t>1.60813</w:t>
       </w:r>
     </w:p>
     <w:p>
@@ -7323,7 +8131,13 @@
         <w:t>​</w:t>
       </w:r>
       <w:r>
-        <w:t>): 56.00 s</w:t>
+        <w:t>): 56.</w:t>
+      </w:r>
+      <w:r>
+        <w:t>46</w:t>
+      </w:r>
+      <w:r>
+        <w:t xml:space="preserve"> s</w:t>
       </w:r>
     </w:p>
     <w:p>
@@ -7359,10 +8173,10 @@
           <w:noProof/>
         </w:rPr>
         <w:drawing>
-          <wp:inline distT="0" distB="0" distL="0" distR="0" wp14:anchorId="0C859524" wp14:editId="0CB573DE">
-            <wp:extent cx="5057877" cy="2851150"/>
-            <wp:effectExtent l="0" t="0" r="9525" b="6350"/>
-            <wp:docPr id="101450946" name="Picture 1" descr="A graph of a function&#10;&#10;AI-generated content may be incorrect."/>
+          <wp:inline distT="0" distB="0" distL="0" distR="0" wp14:anchorId="0C859524" wp14:editId="6CCB880C">
+            <wp:extent cx="5060236" cy="2826529"/>
+            <wp:effectExtent l="0" t="0" r="7620" b="0"/>
+            <wp:docPr id="101450946" name="Picture 1"/>
             <wp:cNvGraphicFramePr>
               <a:graphicFrameLocks xmlns:a="http://schemas.openxmlformats.org/drawingml/2006/main" noChangeAspect="1"/>
             </wp:cNvGraphicFramePr>
@@ -7370,11 +8184,17 @@
               <a:graphicData uri="http://schemas.openxmlformats.org/drawingml/2006/picture">
                 <pic:pic xmlns:pic="http://schemas.openxmlformats.org/drawingml/2006/picture">
                   <pic:nvPicPr>
-                    <pic:cNvPr id="101450946" name="Picture 1" descr="A graph of a function&#10;&#10;AI-generated content may be incorrect."/>
+                    <pic:cNvPr id="101450946" name="Picture 1"/>
                     <pic:cNvPicPr/>
                   </pic:nvPicPr>
                   <pic:blipFill>
-                    <a:blip r:embed="rId12"/>
+                    <a:blip r:embed="rId12" cstate="print">
+                      <a:extLst>
+                        <a:ext uri="{28A0092B-C50C-407E-A947-70E740481C1C}">
+                          <a14:useLocalDpi xmlns:a14="http://schemas.microsoft.com/office/drawing/2010/main" val="0"/>
+                        </a:ext>
+                      </a:extLst>
+                    </a:blip>
                     <a:stretch>
                       <a:fillRect/>
                     </a:stretch>
@@ -7382,7 +8202,7 @@
                   <pic:spPr>
                     <a:xfrm>
                       <a:off x="0" y="0"/>
-                      <a:ext cx="5060236" cy="2852480"/>
+                      <a:ext cx="5060236" cy="2826529"/>
                     </a:xfrm>
                     <a:prstGeom prst="rect">
                       <a:avLst/>
@@ -7463,10 +8283,10 @@
           <w:noProof/>
         </w:rPr>
         <w:drawing>
-          <wp:inline distT="0" distB="0" distL="0" distR="0" wp14:anchorId="57FA8128" wp14:editId="539B8445">
-            <wp:extent cx="5191760" cy="2793174"/>
-            <wp:effectExtent l="0" t="0" r="0" b="7620"/>
-            <wp:docPr id="978277891" name="Picture 1" descr="A diagram of a funnel&#10;&#10;AI-generated content may be incorrect."/>
+          <wp:inline distT="0" distB="0" distL="0" distR="0" wp14:anchorId="57FA8128" wp14:editId="11A174E8">
+            <wp:extent cx="5201633" cy="2740072"/>
+            <wp:effectExtent l="0" t="0" r="0" b="3175"/>
+            <wp:docPr id="978277891" name="Picture 1"/>
             <wp:cNvGraphicFramePr>
               <a:graphicFrameLocks xmlns:a="http://schemas.openxmlformats.org/drawingml/2006/main" noChangeAspect="1"/>
             </wp:cNvGraphicFramePr>
@@ -7474,11 +8294,17 @@
               <a:graphicData uri="http://schemas.openxmlformats.org/drawingml/2006/picture">
                 <pic:pic xmlns:pic="http://schemas.openxmlformats.org/drawingml/2006/picture">
                   <pic:nvPicPr>
-                    <pic:cNvPr id="978277891" name="Picture 1" descr="A diagram of a funnel&#10;&#10;AI-generated content may be incorrect."/>
+                    <pic:cNvPr id="978277891" name="Picture 1"/>
                     <pic:cNvPicPr/>
                   </pic:nvPicPr>
                   <pic:blipFill>
-                    <a:blip r:embed="rId13"/>
+                    <a:blip r:embed="rId13" cstate="print">
+                      <a:extLst>
+                        <a:ext uri="{28A0092B-C50C-407E-A947-70E740481C1C}">
+                          <a14:useLocalDpi xmlns:a14="http://schemas.microsoft.com/office/drawing/2010/main" val="0"/>
+                        </a:ext>
+                      </a:extLst>
+                    </a:blip>
                     <a:stretch>
                       <a:fillRect/>
                     </a:stretch>
@@ -7486,7 +8312,7 @@
                   <pic:spPr>
                     <a:xfrm>
                       <a:off x="0" y="0"/>
-                      <a:ext cx="5201633" cy="2798486"/>
+                      <a:ext cx="5201633" cy="2740072"/>
                     </a:xfrm>
                     <a:prstGeom prst="rect">
                       <a:avLst/>
@@ -7542,20 +8368,12 @@
           <w:rFonts w:eastAsiaTheme="minorEastAsia"/>
         </w:rPr>
       </w:pPr>
-    </w:p>
-    <w:p>
-      <w:pPr>
+      <w:r>
         <w:rPr>
           <w:rFonts w:eastAsiaTheme="minorEastAsia"/>
         </w:rPr>
-      </w:pPr>
-    </w:p>
-    <w:p>
-      <w:pPr>
-        <w:rPr>
-          <w:rFonts w:eastAsiaTheme="minorEastAsia"/>
-        </w:rPr>
-      </w:pPr>
+        <w:br w:type="page"/>
+      </w:r>
     </w:p>
     <w:p>
       <w:pPr>
@@ -7572,6 +8390,7 @@
         <w:rPr>
           <w:rFonts w:eastAsiaTheme="minorEastAsia"/>
         </w:rPr>
+        <w:lastRenderedPageBreak/>
         <w:t>CAD Renders</w:t>
       </w:r>
     </w:p>
@@ -7588,7 +8407,6 @@
         <w:rPr>
           <w:noProof/>
         </w:rPr>
-        <w:lastRenderedPageBreak/>
         <w:drawing>
           <wp:inline distT="0" distB="0" distL="0" distR="0" wp14:anchorId="51F64050" wp14:editId="5B7C45EF">
             <wp:extent cx="3728742" cy="2978150"/>
@@ -7804,7 +8622,7 @@
         </w:numPr>
         <w:ind w:left="709"/>
       </w:pPr>
-      <w:bookmarkStart w:id="14" w:name="_Toc198300849"/>
+      <w:bookmarkStart w:id="14" w:name="_Toc199943868"/>
       <w:r>
         <w:lastRenderedPageBreak/>
         <w:t>Mode 2: Parameter Sweep Analysis</w:t>
@@ -7867,7 +8685,13 @@
         <w:t>​</w:t>
       </w:r>
       <w:r>
-        <w:t>): 1.0 mm to 6.0 mm (6 steps)</w:t>
+        <w:t xml:space="preserve">): </w:t>
+      </w:r>
+      <w:r>
+        <w:t>0.6</w:t>
+      </w:r>
+      <w:r>
+        <w:t xml:space="preserve"> mm to 6.0 mm (6 steps)</w:t>
       </w:r>
     </w:p>
     <w:p>
@@ -21498,6 +22322,15 @@
                 <w:sz w:val="22"/>
                 <w:szCs w:val="22"/>
               </w:rPr>
+              <w:t>6</w:t>
+            </w:r>
+            <w:r>
+              <w:rPr>
+                <w:rFonts w:ascii="Aptos Narrow" w:hAnsi="Aptos Narrow"/>
+                <w:color w:val="000000"/>
+                <w:sz w:val="22"/>
+                <w:szCs w:val="22"/>
+              </w:rPr>
               <w:t>1</w:t>
             </w:r>
           </w:p>
@@ -21702,9 +22535,9 @@
         </w:rPr>
         <w:lastRenderedPageBreak/>
         <w:drawing>
-          <wp:inline distT="0" distB="0" distL="0" distR="0" wp14:anchorId="480C5B2C" wp14:editId="44D97C02">
-            <wp:extent cx="5731510" cy="3132891"/>
-            <wp:effectExtent l="0" t="0" r="2540" b="0"/>
+          <wp:inline distT="0" distB="0" distL="0" distR="0" wp14:anchorId="480C5B2C" wp14:editId="474FB69E">
+            <wp:extent cx="5675429" cy="3132891"/>
+            <wp:effectExtent l="0" t="0" r="1905" b="0"/>
             <wp:docPr id="133821901" name="Picture 1"/>
             <wp:cNvGraphicFramePr>
               <a:graphicFrameLocks xmlns:a="http://schemas.openxmlformats.org/drawingml/2006/main" noChangeAspect="1"/>
@@ -21731,7 +22564,7 @@
                   <pic:spPr>
                     <a:xfrm>
                       <a:off x="0" y="0"/>
-                      <a:ext cx="5731510" cy="3132891"/>
+                      <a:ext cx="5675429" cy="3132891"/>
                     </a:xfrm>
                     <a:prstGeom prst="rect">
                       <a:avLst/>
@@ -21779,6 +22612,74 @@
     <w:p/>
     <w:p>
       <w:r>
+        <w:t>Using weight from the CAD models and thrust from the results above, I can calculate the Thrust to Weight ratio</w:t>
+      </w:r>
+      <w:r>
+        <w:t xml:space="preserve">. </w:t>
+      </w:r>
+    </w:p>
+    <w:p>
+      <w:pPr>
+        <w:keepNext/>
+        <w:jc w:val="center"/>
+      </w:pPr>
+      <w:r>
+        <w:rPr>
+          <w:noProof/>
+        </w:rPr>
+        <w:drawing>
+          <wp:inline distT="0" distB="0" distL="0" distR="0" wp14:anchorId="072A0615" wp14:editId="7237FBDD">
+            <wp:extent cx="4572000" cy="2743200"/>
+            <wp:effectExtent l="0" t="0" r="0" b="0"/>
+            <wp:docPr id="1106318867" name="Chart 1">
+              <a:extLst xmlns:a="http://schemas.openxmlformats.org/drawingml/2006/main">
+                <a:ext uri="{FF2B5EF4-FFF2-40B4-BE49-F238E27FC236}">
+                  <a16:creationId xmlns:a16="http://schemas.microsoft.com/office/drawing/2014/main" id="{3507622E-648B-97B0-BDB6-3CCB433781FD}"/>
+                </a:ext>
+              </a:extLst>
+            </wp:docPr>
+            <wp:cNvGraphicFramePr/>
+            <a:graphic xmlns:a="http://schemas.openxmlformats.org/drawingml/2006/main">
+              <a:graphicData uri="http://schemas.openxmlformats.org/drawingml/2006/chart">
+                <c:chart xmlns:c="http://schemas.openxmlformats.org/drawingml/2006/chart" xmlns:r="http://schemas.openxmlformats.org/officeDocument/2006/relationships" r:id="rId17"/>
+              </a:graphicData>
+            </a:graphic>
+          </wp:inline>
+        </w:drawing>
+      </w:r>
+    </w:p>
+    <w:p>
+      <w:pPr>
+        <w:pStyle w:val="Caption"/>
+        <w:jc w:val="center"/>
+      </w:pPr>
+      <w:r>
+        <w:t xml:space="preserve">Figure </w:t>
+      </w:r>
+      <w:r>
+        <w:fldChar w:fldCharType="begin"/>
+      </w:r>
+      <w:r>
+        <w:instrText xml:space="preserve"> SEQ Figure \* ARABIC </w:instrText>
+      </w:r>
+      <w:r>
+        <w:fldChar w:fldCharType="separate"/>
+      </w:r>
+      <w:r>
+        <w:rPr>
+          <w:noProof/>
+        </w:rPr>
+        <w:t>6</w:t>
+      </w:r>
+      <w:r>
+        <w:fldChar w:fldCharType="end"/>
+      </w:r>
+      <w:r>
+        <w:t>: Thrust to Weigh ratio for each nozzle size</w:t>
+      </w:r>
+    </w:p>
+    <w:p>
+      <w:r>
         <w:br w:type="page"/>
       </w:r>
     </w:p>
@@ -21791,12 +22692,332 @@
         </w:numPr>
         <w:ind w:left="709"/>
       </w:pPr>
-      <w:bookmarkStart w:id="16" w:name="_Toc198300850"/>
+      <w:bookmarkStart w:id="16" w:name="_Toc199943869"/>
+      <w:r>
+        <w:lastRenderedPageBreak/>
+        <w:t>CFD results</w:t>
+      </w:r>
+      <w:bookmarkEnd w:id="16"/>
+      <w:r>
+        <w:t xml:space="preserve"> </w:t>
+      </w:r>
+    </w:p>
+    <w:p>
+      <w:r>
+        <w:t xml:space="preserve">Run to verify </w:t>
+      </w:r>
+      <w:r>
+        <w:t xml:space="preserve">Mode 1 calculation values. </w:t>
+      </w:r>
+      <w:r>
+        <w:t>These values</w:t>
+      </w:r>
+      <w:r>
+        <w:t xml:space="preserve"> match the calculation </w:t>
+      </w:r>
+      <w:r>
+        <w:t xml:space="preserve">with performance calculations python files. </w:t>
+      </w:r>
+    </w:p>
+    <w:p>
+      <w:pPr>
+        <w:keepNext/>
+        <w:jc w:val="center"/>
+      </w:pPr>
+      <w:r>
+        <w:rPr>
+          <w:noProof/>
+        </w:rPr>
+        <w:drawing>
+          <wp:inline distT="0" distB="0" distL="0" distR="0" wp14:anchorId="0E07C615" wp14:editId="5564C053">
+            <wp:extent cx="4358640" cy="1921774"/>
+            <wp:effectExtent l="0" t="0" r="3810" b="2540"/>
+            <wp:docPr id="1074694342" name="Picture 1"/>
+            <wp:cNvGraphicFramePr>
+              <a:graphicFrameLocks xmlns:a="http://schemas.openxmlformats.org/drawingml/2006/main" noChangeAspect="1"/>
+            </wp:cNvGraphicFramePr>
+            <a:graphic xmlns:a="http://schemas.openxmlformats.org/drawingml/2006/main">
+              <a:graphicData uri="http://schemas.openxmlformats.org/drawingml/2006/picture">
+                <pic:pic xmlns:pic="http://schemas.openxmlformats.org/drawingml/2006/picture">
+                  <pic:nvPicPr>
+                    <pic:cNvPr id="0" name="Picture 1"/>
+                    <pic:cNvPicPr>
+                      <a:picLocks noChangeAspect="1" noChangeArrowheads="1"/>
+                    </pic:cNvPicPr>
+                  </pic:nvPicPr>
+                  <pic:blipFill rotWithShape="1">
+                    <a:blip r:embed="rId18" cstate="print">
+                      <a:extLst>
+                        <a:ext uri="{28A0092B-C50C-407E-A947-70E740481C1C}">
+                          <a14:useLocalDpi xmlns:a14="http://schemas.microsoft.com/office/drawing/2010/main" val="0"/>
+                        </a:ext>
+                      </a:extLst>
+                    </a:blip>
+                    <a:srcRect t="14511" r="9028"/>
+                    <a:stretch/>
+                  </pic:blipFill>
+                  <pic:spPr bwMode="auto">
+                    <a:xfrm>
+                      <a:off x="0" y="0"/>
+                      <a:ext cx="4374425" cy="1928734"/>
+                    </a:xfrm>
+                    <a:prstGeom prst="rect">
+                      <a:avLst/>
+                    </a:prstGeom>
+                    <a:noFill/>
+                    <a:ln>
+                      <a:noFill/>
+                    </a:ln>
+                    <a:extLst>
+                      <a:ext uri="{53640926-AAD7-44D8-BBD7-CCE9431645EC}">
+                        <a14:shadowObscured xmlns:a14="http://schemas.microsoft.com/office/drawing/2010/main"/>
+                      </a:ext>
+                    </a:extLst>
+                  </pic:spPr>
+                </pic:pic>
+              </a:graphicData>
+            </a:graphic>
+          </wp:inline>
+        </w:drawing>
+      </w:r>
+    </w:p>
+    <w:p>
+      <w:pPr>
+        <w:pStyle w:val="Caption"/>
+        <w:jc w:val="center"/>
+      </w:pPr>
+      <w:r>
+        <w:t xml:space="preserve">Figure </w:t>
+      </w:r>
+      <w:r>
+        <w:fldChar w:fldCharType="begin"/>
+      </w:r>
+      <w:r>
+        <w:instrText xml:space="preserve"> SEQ Figure \* ARABIC </w:instrText>
+      </w:r>
+      <w:r>
+        <w:fldChar w:fldCharType="separate"/>
+      </w:r>
+      <w:r>
+        <w:rPr>
+          <w:noProof/>
+        </w:rPr>
+        <w:t>7</w:t>
+      </w:r>
+      <w:r>
+        <w:fldChar w:fldCharType="end"/>
+      </w:r>
+      <w:r>
+        <w:t xml:space="preserve">: Mach Number Map </w:t>
+      </w:r>
+      <w:r>
+        <w:t>Cross section</w:t>
+      </w:r>
+    </w:p>
+    <w:p>
+      <w:pPr>
+        <w:keepNext/>
+        <w:jc w:val="center"/>
+      </w:pPr>
+      <w:r>
+        <w:rPr>
+          <w:noProof/>
+        </w:rPr>
+        <w:drawing>
+          <wp:inline distT="0" distB="0" distL="0" distR="0" wp14:anchorId="74D9C427" wp14:editId="50F346CD">
+            <wp:extent cx="4413504" cy="2188735"/>
+            <wp:effectExtent l="0" t="0" r="6350" b="2540"/>
+            <wp:docPr id="1260949996" name="Picture 2"/>
+            <wp:cNvGraphicFramePr>
+              <a:graphicFrameLocks xmlns:a="http://schemas.openxmlformats.org/drawingml/2006/main" noChangeAspect="1"/>
+            </wp:cNvGraphicFramePr>
+            <a:graphic xmlns:a="http://schemas.openxmlformats.org/drawingml/2006/main">
+              <a:graphicData uri="http://schemas.openxmlformats.org/drawingml/2006/picture">
+                <pic:pic xmlns:pic="http://schemas.openxmlformats.org/drawingml/2006/picture">
+                  <pic:nvPicPr>
+                    <pic:cNvPr id="0" name="Picture 2"/>
+                    <pic:cNvPicPr>
+                      <a:picLocks noChangeAspect="1" noChangeArrowheads="1"/>
+                    </pic:cNvPicPr>
+                  </pic:nvPicPr>
+                  <pic:blipFill rotWithShape="1">
+                    <a:blip r:embed="rId19">
+                      <a:extLst>
+                        <a:ext uri="{28A0092B-C50C-407E-A947-70E740481C1C}">
+                          <a14:useLocalDpi xmlns:a14="http://schemas.microsoft.com/office/drawing/2010/main" val="0"/>
+                        </a:ext>
+                      </a:extLst>
+                    </a:blip>
+                    <a:srcRect t="16779" r="21263"/>
+                    <a:stretch/>
+                  </pic:blipFill>
+                  <pic:spPr bwMode="auto">
+                    <a:xfrm>
+                      <a:off x="0" y="0"/>
+                      <a:ext cx="4428173" cy="2196010"/>
+                    </a:xfrm>
+                    <a:prstGeom prst="rect">
+                      <a:avLst/>
+                    </a:prstGeom>
+                    <a:noFill/>
+                    <a:ln>
+                      <a:noFill/>
+                    </a:ln>
+                    <a:extLst>
+                      <a:ext uri="{53640926-AAD7-44D8-BBD7-CCE9431645EC}">
+                        <a14:shadowObscured xmlns:a14="http://schemas.microsoft.com/office/drawing/2010/main"/>
+                      </a:ext>
+                    </a:extLst>
+                  </pic:spPr>
+                </pic:pic>
+              </a:graphicData>
+            </a:graphic>
+          </wp:inline>
+        </w:drawing>
+      </w:r>
+    </w:p>
+    <w:p>
+      <w:pPr>
+        <w:pStyle w:val="Caption"/>
+        <w:jc w:val="center"/>
+      </w:pPr>
+      <w:r>
+        <w:t xml:space="preserve">Figure </w:t>
+      </w:r>
+      <w:r>
+        <w:fldChar w:fldCharType="begin"/>
+      </w:r>
+      <w:r>
+        <w:instrText xml:space="preserve"> SEQ Figure \* ARABIC </w:instrText>
+      </w:r>
+      <w:r>
+        <w:fldChar w:fldCharType="separate"/>
+      </w:r>
+      <w:r>
+        <w:rPr>
+          <w:noProof/>
+        </w:rPr>
+        <w:t>8</w:t>
+      </w:r>
+      <w:r>
+        <w:fldChar w:fldCharType="end"/>
+      </w:r>
+      <w:r>
+        <w:t>: Pressure Map Cross section</w:t>
+      </w:r>
+    </w:p>
+    <w:p>
+      <w:pPr>
+        <w:keepNext/>
+        <w:jc w:val="center"/>
+      </w:pPr>
+      <w:r>
+        <w:rPr>
+          <w:noProof/>
+        </w:rPr>
+        <w:drawing>
+          <wp:inline distT="0" distB="0" distL="0" distR="0" wp14:anchorId="2C6F9782" wp14:editId="4B0066DE">
+            <wp:extent cx="4468368" cy="2371090"/>
+            <wp:effectExtent l="0" t="0" r="8890" b="0"/>
+            <wp:docPr id="193712773" name="Picture 3"/>
+            <wp:cNvGraphicFramePr>
+              <a:graphicFrameLocks xmlns:a="http://schemas.openxmlformats.org/drawingml/2006/main" noChangeAspect="1"/>
+            </wp:cNvGraphicFramePr>
+            <a:graphic xmlns:a="http://schemas.openxmlformats.org/drawingml/2006/main">
+              <a:graphicData uri="http://schemas.openxmlformats.org/drawingml/2006/picture">
+                <pic:pic xmlns:pic="http://schemas.openxmlformats.org/drawingml/2006/picture">
+                  <pic:nvPicPr>
+                    <pic:cNvPr id="0" name="Picture 3"/>
+                    <pic:cNvPicPr>
+                      <a:picLocks noChangeAspect="1" noChangeArrowheads="1"/>
+                    </pic:cNvPicPr>
+                  </pic:nvPicPr>
+                  <pic:blipFill rotWithShape="1">
+                    <a:blip r:embed="rId20">
+                      <a:extLst>
+                        <a:ext uri="{28A0092B-C50C-407E-A947-70E740481C1C}">
+                          <a14:useLocalDpi xmlns:a14="http://schemas.microsoft.com/office/drawing/2010/main" val="0"/>
+                        </a:ext>
+                      </a:extLst>
+                    </a:blip>
+                    <a:srcRect t="11790" r="22004"/>
+                    <a:stretch/>
+                  </pic:blipFill>
+                  <pic:spPr bwMode="auto">
+                    <a:xfrm>
+                      <a:off x="0" y="0"/>
+                      <a:ext cx="4469325" cy="2371598"/>
+                    </a:xfrm>
+                    <a:prstGeom prst="rect">
+                      <a:avLst/>
+                    </a:prstGeom>
+                    <a:noFill/>
+                    <a:ln>
+                      <a:noFill/>
+                    </a:ln>
+                    <a:extLst>
+                      <a:ext uri="{53640926-AAD7-44D8-BBD7-CCE9431645EC}">
+                        <a14:shadowObscured xmlns:a14="http://schemas.microsoft.com/office/drawing/2010/main"/>
+                      </a:ext>
+                    </a:extLst>
+                  </pic:spPr>
+                </pic:pic>
+              </a:graphicData>
+            </a:graphic>
+          </wp:inline>
+        </w:drawing>
+      </w:r>
+    </w:p>
+    <w:p>
+      <w:pPr>
+        <w:pStyle w:val="Caption"/>
+        <w:jc w:val="center"/>
+      </w:pPr>
+      <w:r>
+        <w:t xml:space="preserve">Figure </w:t>
+      </w:r>
+      <w:r>
+        <w:fldChar w:fldCharType="begin"/>
+      </w:r>
+      <w:r>
+        <w:instrText xml:space="preserve"> SEQ Figure \* ARABIC </w:instrText>
+      </w:r>
+      <w:r>
+        <w:fldChar w:fldCharType="separate"/>
+      </w:r>
+      <w:r>
+        <w:rPr>
+          <w:noProof/>
+        </w:rPr>
+        <w:t>9</w:t>
+      </w:r>
+      <w:r>
+        <w:fldChar w:fldCharType="end"/>
+      </w:r>
+      <w:r>
+        <w:t>: Temperature Map Cross Section</w:t>
+      </w:r>
+    </w:p>
+    <w:p>
+      <w:r>
+        <w:br w:type="page"/>
+      </w:r>
+    </w:p>
+    <w:p>
+      <w:pPr>
+        <w:pStyle w:val="Heading2"/>
+        <w:numPr>
+          <w:ilvl w:val="1"/>
+          <w:numId w:val="4"/>
+        </w:numPr>
+        <w:ind w:left="709"/>
+      </w:pPr>
+      <w:bookmarkStart w:id="17" w:name="_Toc199943870"/>
       <w:r>
         <w:lastRenderedPageBreak/>
         <w:t>Discussion of Sweep Results (Key Findings)</w:t>
       </w:r>
-      <w:bookmarkEnd w:id="16"/>
+      <w:bookmarkEnd w:id="17"/>
       <w:r>
         <w:t xml:space="preserve"> </w:t>
       </w:r>
@@ -21897,6 +23118,32 @@
         <w:t>Larger R_throat_m increases thrust and mass flow rate due to the larger throat area, but also results in a longer nozzle, impacting size and weight</w:t>
       </w:r>
     </w:p>
+    <w:p>
+      <w:pPr>
+        <w:numPr>
+          <w:ilvl w:val="1"/>
+          <w:numId w:val="19"/>
+        </w:numPr>
+      </w:pPr>
+      <w:r>
+        <w:t>Based on the Thrust to Weight ratio</w:t>
+      </w:r>
+      <w:r>
+        <w:t xml:space="preserve">, </w:t>
+      </w:r>
+      <w:r>
+        <w:t>the benefits of the thrust outweigh the</w:t>
+      </w:r>
+      <w:r>
+        <w:t xml:space="preserve"> increasing weight. </w:t>
+      </w:r>
+      <w:r>
+        <w:t>So,</w:t>
+      </w:r>
+      <w:r>
+        <w:t xml:space="preserve"> the weight should be determined by the capacity of the propellant onboard and duration of the mission </w:t>
+      </w:r>
+    </w:p>
     <w:p/>
     <w:p>
       <w:pPr>
@@ -21979,6 +23226,54 @@
       </w:r>
       <w:r>
         <w:t xml:space="preserve"> which may be constrained by propellant supply or structural limits. The choice depends on mission requirements (e.g., thrust vs. size).</w:t>
+      </w:r>
+    </w:p>
+    <w:p>
+      <w:pPr>
+        <w:numPr>
+          <w:ilvl w:val="0"/>
+          <w:numId w:val="20"/>
+        </w:numPr>
+      </w:pPr>
+      <w:r>
+        <w:rPr>
+          <w:b/>
+          <w:bCs/>
+        </w:rPr>
+        <w:t>Overall</w:t>
+      </w:r>
+      <w:r>
+        <w:t>:</w:t>
+      </w:r>
+      <w:r>
+        <w:t xml:space="preserve"> </w:t>
+      </w:r>
+      <w:r>
+        <w:t>the nozzle performance tends to be better when</w:t>
+      </w:r>
+      <w:r>
+        <w:t xml:space="preserve"> </w:t>
+      </w:r>
+      <w:r>
+        <w:t>the throat siz</w:t>
+      </w:r>
+      <w:r>
+        <w:t>e</w:t>
+      </w:r>
+      <w:r>
+        <w:t xml:space="preserve"> is larger and higher stagnant temperatures. </w:t>
+      </w:r>
+      <w:r>
+        <w:t>The throat size limit</w:t>
+      </w:r>
+      <w:r>
+        <w:t xml:space="preserve"> </w:t>
+      </w:r>
+      <w:r>
+        <w:t xml:space="preserve">depends on the propellant capacity </w:t>
+      </w:r>
+      <w:r>
+        <w:t>of the</w:t>
       </w:r>
     </w:p>
     <w:p>
@@ -22022,42 +23317,6 @@
         <w:rPr>
           <w:rFonts w:eastAsiaTheme="minorEastAsia"/>
         </w:rPr>
-        <w:t>thrust to weight ratio</w:t>
-      </w:r>
-      <w:r>
-        <w:rPr>
-          <w:rFonts w:eastAsiaTheme="minorEastAsia"/>
-        </w:rPr>
-        <w:t xml:space="preserve"> vs Isp</w:t>
-      </w:r>
-    </w:p>
-    <w:p>
-      <w:pPr>
-        <w:pStyle w:val="ListParagraph"/>
-        <w:numPr>
-          <w:ilvl w:val="0"/>
-          <w:numId w:val="21"/>
-        </w:numPr>
-        <w:rPr>
-          <w:rFonts w:eastAsiaTheme="minorEastAsia"/>
-        </w:rPr>
-      </w:pPr>
-      <w:r>
-        <w:rPr>
-          <w:rFonts w:eastAsiaTheme="minorEastAsia"/>
-        </w:rPr>
-        <w:t>Trade-off analysis:</w:t>
-      </w:r>
-      <w:r>
-        <w:rPr>
-          <w:rFonts w:eastAsiaTheme="minorEastAsia"/>
-        </w:rPr>
-        <w:t xml:space="preserve"> </w:t>
-      </w:r>
-      <w:r>
-        <w:rPr>
-          <w:rFonts w:eastAsiaTheme="minorEastAsia"/>
-        </w:rPr>
         <w:t xml:space="preserve">required power sources vs </w:t>
       </w:r>
       <w:r>
@@ -22089,12 +23348,12 @@
         </w:numPr>
         <w:ind w:left="284"/>
       </w:pPr>
-      <w:bookmarkStart w:id="17" w:name="_Toc198300851"/>
+      <w:bookmarkStart w:id="18" w:name="_Toc199943871"/>
       <w:r>
         <w:lastRenderedPageBreak/>
         <w:t>Conclusion</w:t>
       </w:r>
-      <w:bookmarkEnd w:id="17"/>
+      <w:bookmarkEnd w:id="18"/>
       <w:r>
         <w:t xml:space="preserve"> </w:t>
       </w:r>
@@ -22330,12 +23589,12 @@
         </w:numPr>
         <w:ind w:left="284"/>
       </w:pPr>
-      <w:bookmarkStart w:id="18" w:name="_Toc198300852"/>
+      <w:bookmarkStart w:id="19" w:name="_Toc199943872"/>
       <w:r>
         <w:lastRenderedPageBreak/>
         <w:t>Reference</w:t>
       </w:r>
-      <w:bookmarkEnd w:id="18"/>
+      <w:bookmarkEnd w:id="19"/>
       <w:r>
         <w:t xml:space="preserve"> </w:t>
       </w:r>
@@ -22362,6 +23621,7 @@
           <w:color w:val="000000"/>
           <w:sz w:val="27"/>
           <w:szCs w:val="27"/>
+          <w:lang w:val="sv-SE"/>
         </w:rPr>
         <w:t>Sutton, G. P., &amp; Biblarz, O. (201</w:t>
       </w:r>
@@ -22371,6 +23631,7 @@
           <w:color w:val="000000"/>
           <w:sz w:val="27"/>
           <w:szCs w:val="27"/>
+          <w:lang w:val="sv-SE"/>
         </w:rPr>
         <w:t>6</w:t>
       </w:r>
@@ -22380,6 +23641,7 @@
           <w:color w:val="000000"/>
           <w:sz w:val="27"/>
           <w:szCs w:val="27"/>
+          <w:lang w:val="sv-SE"/>
         </w:rPr>
         <w:t>). </w:t>
       </w:r>
@@ -22447,7 +23709,7 @@
         </w:rPr>
         <w:t>. Aspirespace. Retrieved May 16, 2025, from </w:t>
       </w:r>
-      <w:hyperlink r:id="rId17" w:history="1">
+      <w:hyperlink r:id="rId21" w:history="1">
         <w:r>
           <w:rPr>
             <w:rStyle w:val="Hyperlink"/>
@@ -22484,7 +23746,7 @@
         </w:rPr>
         <w:t>TheEngineer, J. (n.d.). Normal Shock Calculations. JoshTheEngineer.com. Retrieved May 16, 2025, from </w:t>
       </w:r>
-      <w:hyperlink r:id="rId18" w:history="1">
+      <w:hyperlink r:id="rId22" w:history="1">
         <w:r>
           <w:rPr>
             <w:rStyle w:val="Hyperlink"/>
@@ -22578,12 +23840,12 @@
         </w:numPr>
         <w:ind w:left="284"/>
       </w:pPr>
-      <w:bookmarkStart w:id="19" w:name="_Toc198300853"/>
+      <w:bookmarkStart w:id="20" w:name="_Toc199943873"/>
       <w:r>
         <w:lastRenderedPageBreak/>
         <w:t>Appendices</w:t>
       </w:r>
-      <w:bookmarkEnd w:id="19"/>
+      <w:bookmarkEnd w:id="20"/>
       <w:r>
         <w:t xml:space="preserve"> </w:t>
       </w:r>
@@ -22597,11 +23859,11 @@
         </w:numPr>
         <w:ind w:left="709"/>
       </w:pPr>
-      <w:bookmarkStart w:id="20" w:name="_Toc198300854"/>
+      <w:bookmarkStart w:id="21" w:name="_Toc199943874"/>
       <w:r>
         <w:t>Previous calculation notes</w:t>
       </w:r>
-      <w:bookmarkEnd w:id="20"/>
+      <w:bookmarkEnd w:id="21"/>
       <w:r>
         <w:t xml:space="preserve"> </w:t>
       </w:r>
@@ -23584,7 +24846,80 @@
         </m:oMath>
       </m:oMathPara>
     </w:p>
-    <w:p/>
+    <w:p>
+      <w:r>
+        <w:br w:type="page"/>
+      </w:r>
+    </w:p>
+    <w:p>
+      <w:pPr>
+        <w:pStyle w:val="Heading2"/>
+        <w:numPr>
+          <w:ilvl w:val="1"/>
+          <w:numId w:val="18"/>
+        </w:numPr>
+        <w:ind w:left="709"/>
+      </w:pPr>
+      <w:bookmarkStart w:id="22" w:name="_Toc199943875"/>
+      <w:r>
+        <w:lastRenderedPageBreak/>
+        <w:t>Decision Matrix</w:t>
+      </w:r>
+      <w:bookmarkEnd w:id="22"/>
+    </w:p>
+    <w:p>
+      <w:r>
+        <w:t>B</w:t>
+      </w:r>
+      <w:r>
+        <w:t>ased on importance of each aspect and the relationship between nozzle size and stag temperature</w:t>
+      </w:r>
+      <w:r>
+        <w:t>, the plot can be shown below.</w:t>
+      </w:r>
+    </w:p>
+    <w:p>
+      <w:r>
+        <w:rPr>
+          <w:noProof/>
+        </w:rPr>
+        <w:drawing>
+          <wp:inline distT="0" distB="0" distL="0" distR="0" wp14:anchorId="31465B7E" wp14:editId="055CA614">
+            <wp:extent cx="4435114" cy="2590999"/>
+            <wp:effectExtent l="0" t="0" r="3810" b="0"/>
+            <wp:docPr id="219279380" name="Picture 1" descr="A diagram of a diagram&#10;&#10;AI-generated content may be incorrect."/>
+            <wp:cNvGraphicFramePr>
+              <a:graphicFrameLocks xmlns:a="http://schemas.openxmlformats.org/drawingml/2006/main" noChangeAspect="1"/>
+            </wp:cNvGraphicFramePr>
+            <a:graphic xmlns:a="http://schemas.openxmlformats.org/drawingml/2006/main">
+              <a:graphicData uri="http://schemas.openxmlformats.org/drawingml/2006/picture">
+                <pic:pic xmlns:pic="http://schemas.openxmlformats.org/drawingml/2006/picture">
+                  <pic:nvPicPr>
+                    <pic:cNvPr id="219279380" name="Picture 1" descr="A diagram of a diagram&#10;&#10;AI-generated content may be incorrect."/>
+                    <pic:cNvPicPr/>
+                  </pic:nvPicPr>
+                  <pic:blipFill>
+                    <a:blip r:embed="rId23"/>
+                    <a:stretch>
+                      <a:fillRect/>
+                    </a:stretch>
+                  </pic:blipFill>
+                  <pic:spPr>
+                    <a:xfrm>
+                      <a:off x="0" y="0"/>
+                      <a:ext cx="4436148" cy="2591603"/>
+                    </a:xfrm>
+                    <a:prstGeom prst="rect">
+                      <a:avLst/>
+                    </a:prstGeom>
+                  </pic:spPr>
+                </pic:pic>
+              </a:graphicData>
+            </a:graphic>
+          </wp:inline>
+        </w:drawing>
+      </w:r>
+    </w:p>
     <w:sectPr>
       <w:pgSz w:w="11906" w:h="16838"/>
       <w:pgMar w:top="1440" w:right="1440" w:bottom="1440" w:left="1440" w:header="708" w:footer="708" w:gutter="0"/>
@@ -26929,6 +28264,7 @@
   <w:style w:type="character" w:default="1" w:styleId="DefaultParagraphFont">
     <w:name w:val="Default Paragraph Font"/>
     <w:uiPriority w:val="1"/>
+    <w:semiHidden/>
     <w:unhideWhenUsed/>
   </w:style>
   <w:style w:type="table" w:default="1" w:styleId="TableNormal">
@@ -27380,6 +28716,867 @@
     </w:rPr>
   </w:style>
 </w:styles>
+</file>
+
+<file path=word/charts/chart1.xml><?xml version="1.0" encoding="utf-8"?>
+<c:chartSpace xmlns:c="http://schemas.openxmlformats.org/drawingml/2006/chart" xmlns:a="http://schemas.openxmlformats.org/drawingml/2006/main" xmlns:r="http://schemas.openxmlformats.org/officeDocument/2006/relationships" xmlns:c16r2="http://schemas.microsoft.com/office/drawing/2015/06/chart">
+  <c:date1904 val="0"/>
+  <c:lang val="en-US"/>
+  <c:roundedCorners val="0"/>
+  <mc:AlternateContent xmlns:mc="http://schemas.openxmlformats.org/markup-compatibility/2006">
+    <mc:Choice xmlns:c14="http://schemas.microsoft.com/office/drawing/2007/8/2/chart" Requires="c14">
+      <c14:style val="102"/>
+    </mc:Choice>
+    <mc:Fallback>
+      <c:style val="2"/>
+    </mc:Fallback>
+  </mc:AlternateContent>
+  <c:chart>
+    <c:title>
+      <c:tx>
+        <c:strRef>
+          <c:f>ThrustWeight!$F$1</c:f>
+          <c:strCache>
+            <c:ptCount val="1"/>
+            <c:pt idx="0">
+              <c:v>Thrust/Weight (kg/N)</c:v>
+            </c:pt>
+          </c:strCache>
+        </c:strRef>
+      </c:tx>
+      <c:overlay val="0"/>
+      <c:spPr>
+        <a:noFill/>
+        <a:ln>
+          <a:noFill/>
+        </a:ln>
+        <a:effectLst/>
+      </c:spPr>
+      <c:txPr>
+        <a:bodyPr rot="0" spcFirstLastPara="1" vertOverflow="ellipsis" vert="horz" wrap="square" anchor="ctr" anchorCtr="1"/>
+        <a:lstStyle/>
+        <a:p>
+          <a:pPr>
+            <a:defRPr sz="1400" b="0" i="0" u="none" strike="noStrike" kern="1200" spc="0" baseline="0">
+              <a:solidFill>
+                <a:schemeClr val="tx1">
+                  <a:lumMod val="65000"/>
+                  <a:lumOff val="35000"/>
+                </a:schemeClr>
+              </a:solidFill>
+              <a:latin typeface="+mn-lt"/>
+              <a:ea typeface="+mn-ea"/>
+              <a:cs typeface="+mn-cs"/>
+            </a:defRPr>
+          </a:pPr>
+          <a:endParaRPr lang="en-US"/>
+        </a:p>
+      </c:txPr>
+    </c:title>
+    <c:autoTitleDeleted val="0"/>
+    <c:plotArea>
+      <c:layout/>
+      <c:lineChart>
+        <c:grouping val="standard"/>
+        <c:varyColors val="0"/>
+        <c:ser>
+          <c:idx val="0"/>
+          <c:order val="0"/>
+          <c:spPr>
+            <a:ln w="28575" cap="rnd">
+              <a:solidFill>
+                <a:schemeClr val="accent1"/>
+              </a:solidFill>
+              <a:round/>
+            </a:ln>
+            <a:effectLst/>
+          </c:spPr>
+          <c:marker>
+            <c:symbol val="none"/>
+          </c:marker>
+          <c:cat>
+            <c:strRef>
+              <c:f>ThrustWeight!$A$2:$A$7</c:f>
+              <c:strCache>
+                <c:ptCount val="6"/>
+                <c:pt idx="0">
+                  <c:v>Default 0.6mm</c:v>
+                </c:pt>
+                <c:pt idx="1">
+                  <c:v>Rt 1.5mm</c:v>
+                </c:pt>
+                <c:pt idx="2">
+                  <c:v>Rt 2.4mm</c:v>
+                </c:pt>
+                <c:pt idx="3">
+                  <c:v>Rt 3.2mm</c:v>
+                </c:pt>
+                <c:pt idx="4">
+                  <c:v>Rt 4.1mm</c:v>
+                </c:pt>
+                <c:pt idx="5">
+                  <c:v>Rt 5.0mm</c:v>
+                </c:pt>
+              </c:strCache>
+            </c:strRef>
+          </c:cat>
+          <c:val>
+            <c:numRef>
+              <c:f>ThrustWeight!$F$2:$F$7</c:f>
+              <c:numCache>
+                <c:formatCode>General</c:formatCode>
+                <c:ptCount val="6"/>
+                <c:pt idx="0">
+                  <c:v>0.23762376237623761</c:v>
+                </c:pt>
+                <c:pt idx="1">
+                  <c:v>0.75819672131147553</c:v>
+                </c:pt>
+                <c:pt idx="2">
+                  <c:v>1.0375275938189845</c:v>
+                </c:pt>
+                <c:pt idx="3">
+                  <c:v>1.2381951731374607</c:v>
+                </c:pt>
+                <c:pt idx="4">
+                  <c:v>1.305340027384756</c:v>
+                </c:pt>
+                <c:pt idx="5">
+                  <c:v>1.343331206126356</c:v>
+                </c:pt>
+              </c:numCache>
+            </c:numRef>
+          </c:val>
+          <c:smooth val="0"/>
+          <c:extLst>
+            <c:ext xmlns:c16="http://schemas.microsoft.com/office/drawing/2014/chart" uri="{C3380CC4-5D6E-409C-BE32-E72D297353CC}">
+              <c16:uniqueId val="{00000000-DBF2-4F9A-82BC-4BD5E3945F49}"/>
+            </c:ext>
+          </c:extLst>
+        </c:ser>
+        <c:dLbls>
+          <c:showLegendKey val="0"/>
+          <c:showVal val="0"/>
+          <c:showCatName val="0"/>
+          <c:showSerName val="0"/>
+          <c:showPercent val="0"/>
+          <c:showBubbleSize val="0"/>
+        </c:dLbls>
+        <c:smooth val="0"/>
+        <c:axId val="278537439"/>
+        <c:axId val="1501747119"/>
+      </c:lineChart>
+      <c:catAx>
+        <c:axId val="278537439"/>
+        <c:scaling>
+          <c:orientation val="minMax"/>
+        </c:scaling>
+        <c:delete val="0"/>
+        <c:axPos val="b"/>
+        <c:numFmt formatCode="General" sourceLinked="1"/>
+        <c:majorTickMark val="none"/>
+        <c:minorTickMark val="none"/>
+        <c:tickLblPos val="nextTo"/>
+        <c:spPr>
+          <a:noFill/>
+          <a:ln w="9525" cap="flat" cmpd="sng" algn="ctr">
+            <a:solidFill>
+              <a:schemeClr val="tx1">
+                <a:lumMod val="15000"/>
+                <a:lumOff val="85000"/>
+              </a:schemeClr>
+            </a:solidFill>
+            <a:round/>
+          </a:ln>
+          <a:effectLst/>
+        </c:spPr>
+        <c:txPr>
+          <a:bodyPr rot="-60000000" spcFirstLastPara="1" vertOverflow="ellipsis" vert="horz" wrap="square" anchor="ctr" anchorCtr="1"/>
+          <a:lstStyle/>
+          <a:p>
+            <a:pPr>
+              <a:defRPr sz="900" b="0" i="0" u="none" strike="noStrike" kern="1200" baseline="0">
+                <a:solidFill>
+                  <a:schemeClr val="tx1">
+                    <a:lumMod val="65000"/>
+                    <a:lumOff val="35000"/>
+                  </a:schemeClr>
+                </a:solidFill>
+                <a:latin typeface="+mn-lt"/>
+                <a:ea typeface="+mn-ea"/>
+                <a:cs typeface="+mn-cs"/>
+              </a:defRPr>
+            </a:pPr>
+            <a:endParaRPr lang="en-US"/>
+          </a:p>
+        </c:txPr>
+        <c:crossAx val="1501747119"/>
+        <c:crosses val="autoZero"/>
+        <c:auto val="1"/>
+        <c:lblAlgn val="ctr"/>
+        <c:lblOffset val="100"/>
+        <c:noMultiLvlLbl val="0"/>
+      </c:catAx>
+      <c:valAx>
+        <c:axId val="1501747119"/>
+        <c:scaling>
+          <c:orientation val="minMax"/>
+        </c:scaling>
+        <c:delete val="0"/>
+        <c:axPos val="l"/>
+        <c:majorGridlines>
+          <c:spPr>
+            <a:ln w="9525" cap="flat" cmpd="sng" algn="ctr">
+              <a:solidFill>
+                <a:schemeClr val="tx1">
+                  <a:lumMod val="15000"/>
+                  <a:lumOff val="85000"/>
+                </a:schemeClr>
+              </a:solidFill>
+              <a:round/>
+            </a:ln>
+            <a:effectLst/>
+          </c:spPr>
+        </c:majorGridlines>
+        <c:numFmt formatCode="General" sourceLinked="1"/>
+        <c:majorTickMark val="none"/>
+        <c:minorTickMark val="none"/>
+        <c:tickLblPos val="nextTo"/>
+        <c:spPr>
+          <a:noFill/>
+          <a:ln>
+            <a:noFill/>
+          </a:ln>
+          <a:effectLst/>
+        </c:spPr>
+        <c:txPr>
+          <a:bodyPr rot="-60000000" spcFirstLastPara="1" vertOverflow="ellipsis" vert="horz" wrap="square" anchor="ctr" anchorCtr="1"/>
+          <a:lstStyle/>
+          <a:p>
+            <a:pPr>
+              <a:defRPr sz="900" b="0" i="0" u="none" strike="noStrike" kern="1200" baseline="0">
+                <a:solidFill>
+                  <a:schemeClr val="tx1">
+                    <a:lumMod val="65000"/>
+                    <a:lumOff val="35000"/>
+                  </a:schemeClr>
+                </a:solidFill>
+                <a:latin typeface="+mn-lt"/>
+                <a:ea typeface="+mn-ea"/>
+                <a:cs typeface="+mn-cs"/>
+              </a:defRPr>
+            </a:pPr>
+            <a:endParaRPr lang="en-US"/>
+          </a:p>
+        </c:txPr>
+        <c:crossAx val="278537439"/>
+        <c:crosses val="autoZero"/>
+        <c:crossBetween val="between"/>
+      </c:valAx>
+      <c:spPr>
+        <a:noFill/>
+        <a:ln>
+          <a:noFill/>
+        </a:ln>
+        <a:effectLst/>
+      </c:spPr>
+    </c:plotArea>
+    <c:plotVisOnly val="1"/>
+    <c:dispBlanksAs val="gap"/>
+    <c:extLst>
+      <c:ext xmlns:c16r3="http://schemas.microsoft.com/office/drawing/2017/03/chart" uri="{56B9EC1D-385E-4148-901F-78D8002777C0}">
+        <c16r3:dataDisplayOptions16>
+          <c16r3:dispNaAsBlank val="1"/>
+        </c16r3:dataDisplayOptions16>
+      </c:ext>
+    </c:extLst>
+    <c:showDLblsOverMax val="0"/>
+  </c:chart>
+  <c:spPr>
+    <a:solidFill>
+      <a:schemeClr val="bg1"/>
+    </a:solidFill>
+    <a:ln w="9525" cap="flat" cmpd="sng" algn="ctr">
+      <a:solidFill>
+        <a:schemeClr val="tx1">
+          <a:lumMod val="15000"/>
+          <a:lumOff val="85000"/>
+        </a:schemeClr>
+      </a:solidFill>
+      <a:round/>
+    </a:ln>
+    <a:effectLst/>
+  </c:spPr>
+  <c:txPr>
+    <a:bodyPr/>
+    <a:lstStyle/>
+    <a:p>
+      <a:pPr>
+        <a:defRPr/>
+      </a:pPr>
+      <a:endParaRPr lang="en-US"/>
+    </a:p>
+  </c:txPr>
+  <c:externalData r:id="rId3">
+    <c:autoUpdate val="0"/>
+  </c:externalData>
+</c:chartSpace>
+</file>
+
+<file path=word/charts/colors1.xml><?xml version="1.0" encoding="utf-8"?>
+<cs:colorStyle xmlns:cs="http://schemas.microsoft.com/office/drawing/2012/chartStyle" xmlns:a="http://schemas.openxmlformats.org/drawingml/2006/main" meth="cycle" id="10">
+  <a:schemeClr val="accent1"/>
+  <a:schemeClr val="accent2"/>
+  <a:schemeClr val="accent3"/>
+  <a:schemeClr val="accent4"/>
+  <a:schemeClr val="accent5"/>
+  <a:schemeClr val="accent6"/>
+  <cs:variation/>
+  <cs:variation>
+    <a:lumMod val="60000"/>
+  </cs:variation>
+  <cs:variation>
+    <a:lumMod val="80000"/>
+    <a:lumOff val="20000"/>
+  </cs:variation>
+  <cs:variation>
+    <a:lumMod val="80000"/>
+  </cs:variation>
+  <cs:variation>
+    <a:lumMod val="60000"/>
+    <a:lumOff val="40000"/>
+  </cs:variation>
+  <cs:variation>
+    <a:lumMod val="50000"/>
+  </cs:variation>
+  <cs:variation>
+    <a:lumMod val="70000"/>
+    <a:lumOff val="30000"/>
+  </cs:variation>
+  <cs:variation>
+    <a:lumMod val="70000"/>
+  </cs:variation>
+  <cs:variation>
+    <a:lumMod val="50000"/>
+    <a:lumOff val="50000"/>
+  </cs:variation>
+</cs:colorStyle>
+</file>
+
+<file path=word/charts/style1.xml><?xml version="1.0" encoding="utf-8"?>
+<cs:chartStyle xmlns:cs="http://schemas.microsoft.com/office/drawing/2012/chartStyle" xmlns:a="http://schemas.openxmlformats.org/drawingml/2006/main" id="227">
+  <cs:axisTitle>
+    <cs:lnRef idx="0"/>
+    <cs:fillRef idx="0"/>
+    <cs:effectRef idx="0"/>
+    <cs:fontRef idx="minor">
+      <a:schemeClr val="tx1">
+        <a:lumMod val="65000"/>
+        <a:lumOff val="35000"/>
+      </a:schemeClr>
+    </cs:fontRef>
+    <cs:defRPr sz="1000" kern="1200"/>
+  </cs:axisTitle>
+  <cs:categoryAxis>
+    <cs:lnRef idx="0"/>
+    <cs:fillRef idx="0"/>
+    <cs:effectRef idx="0"/>
+    <cs:fontRef idx="minor">
+      <a:schemeClr val="tx1">
+        <a:lumMod val="65000"/>
+        <a:lumOff val="35000"/>
+      </a:schemeClr>
+    </cs:fontRef>
+    <cs:spPr>
+      <a:ln w="9525" cap="flat" cmpd="sng" algn="ctr">
+        <a:solidFill>
+          <a:schemeClr val="tx1">
+            <a:lumMod val="15000"/>
+            <a:lumOff val="85000"/>
+          </a:schemeClr>
+        </a:solidFill>
+        <a:round/>
+      </a:ln>
+    </cs:spPr>
+    <cs:defRPr sz="900" kern="1200"/>
+  </cs:categoryAxis>
+  <cs:chartArea mods="allowNoFillOverride allowNoLineOverride">
+    <cs:lnRef idx="0"/>
+    <cs:fillRef idx="0"/>
+    <cs:effectRef idx="0"/>
+    <cs:fontRef idx="minor">
+      <a:schemeClr val="tx1"/>
+    </cs:fontRef>
+    <cs:spPr>
+      <a:solidFill>
+        <a:schemeClr val="bg1"/>
+      </a:solidFill>
+      <a:ln w="9525" cap="flat" cmpd="sng" algn="ctr">
+        <a:solidFill>
+          <a:schemeClr val="tx1">
+            <a:lumMod val="15000"/>
+            <a:lumOff val="85000"/>
+          </a:schemeClr>
+        </a:solidFill>
+        <a:round/>
+      </a:ln>
+    </cs:spPr>
+    <cs:defRPr sz="1000" kern="1200"/>
+  </cs:chartArea>
+  <cs:dataLabel>
+    <cs:lnRef idx="0"/>
+    <cs:fillRef idx="0"/>
+    <cs:effectRef idx="0"/>
+    <cs:fontRef idx="minor">
+      <a:schemeClr val="tx1">
+        <a:lumMod val="75000"/>
+        <a:lumOff val="25000"/>
+      </a:schemeClr>
+    </cs:fontRef>
+    <cs:defRPr sz="900" kern="1200"/>
+  </cs:dataLabel>
+  <cs:dataLabelCallout>
+    <cs:lnRef idx="0"/>
+    <cs:fillRef idx="0"/>
+    <cs:effectRef idx="0"/>
+    <cs:fontRef idx="minor">
+      <a:schemeClr val="dk1">
+        <a:lumMod val="65000"/>
+        <a:lumOff val="35000"/>
+      </a:schemeClr>
+    </cs:fontRef>
+    <cs:spPr>
+      <a:solidFill>
+        <a:schemeClr val="lt1"/>
+      </a:solidFill>
+      <a:ln>
+        <a:solidFill>
+          <a:schemeClr val="dk1">
+            <a:lumMod val="25000"/>
+            <a:lumOff val="75000"/>
+          </a:schemeClr>
+        </a:solidFill>
+      </a:ln>
+    </cs:spPr>
+    <cs:defRPr sz="900" kern="1200"/>
+    <cs:bodyPr rot="0" spcFirstLastPara="1" vertOverflow="clip" horzOverflow="clip" vert="horz" wrap="square" lIns="36576" tIns="18288" rIns="36576" bIns="18288" anchor="ctr" anchorCtr="1">
+      <a:spAutoFit/>
+    </cs:bodyPr>
+  </cs:dataLabelCallout>
+  <cs:dataPoint>
+    <cs:lnRef idx="0"/>
+    <cs:fillRef idx="1">
+      <cs:styleClr val="auto"/>
+    </cs:fillRef>
+    <cs:effectRef idx="0"/>
+    <cs:fontRef idx="minor">
+      <a:schemeClr val="tx1"/>
+    </cs:fontRef>
+    <cs:spPr>
+      <a:solidFill>
+        <a:schemeClr val="phClr"/>
+      </a:solidFill>
+    </cs:spPr>
+  </cs:dataPoint>
+  <cs:dataPoint3D>
+    <cs:lnRef idx="0"/>
+    <cs:fillRef idx="1">
+      <cs:styleClr val="auto"/>
+    </cs:fillRef>
+    <cs:effectRef idx="0"/>
+    <cs:fontRef idx="minor">
+      <a:schemeClr val="tx1"/>
+    </cs:fontRef>
+    <cs:spPr>
+      <a:solidFill>
+        <a:schemeClr val="phClr"/>
+      </a:solidFill>
+    </cs:spPr>
+  </cs:dataPoint3D>
+  <cs:dataPointLine>
+    <cs:lnRef idx="0">
+      <cs:styleClr val="auto"/>
+    </cs:lnRef>
+    <cs:fillRef idx="1"/>
+    <cs:effectRef idx="0"/>
+    <cs:fontRef idx="minor">
+      <a:schemeClr val="tx1"/>
+    </cs:fontRef>
+    <cs:spPr>
+      <a:ln w="28575" cap="rnd">
+        <a:solidFill>
+          <a:schemeClr val="phClr"/>
+        </a:solidFill>
+        <a:round/>
+      </a:ln>
+    </cs:spPr>
+  </cs:dataPointLine>
+  <cs:dataPointMarker>
+    <cs:lnRef idx="0">
+      <cs:styleClr val="auto"/>
+    </cs:lnRef>
+    <cs:fillRef idx="1">
+      <cs:styleClr val="auto"/>
+    </cs:fillRef>
+    <cs:effectRef idx="0"/>
+    <cs:fontRef idx="minor">
+      <a:schemeClr val="tx1"/>
+    </cs:fontRef>
+    <cs:spPr>
+      <a:solidFill>
+        <a:schemeClr val="phClr"/>
+      </a:solidFill>
+      <a:ln w="9525">
+        <a:solidFill>
+          <a:schemeClr val="phClr"/>
+        </a:solidFill>
+      </a:ln>
+    </cs:spPr>
+  </cs:dataPointMarker>
+  <cs:dataPointMarkerLayout symbol="circle" size="5"/>
+  <cs:dataPointWireframe>
+    <cs:lnRef idx="0">
+      <cs:styleClr val="auto"/>
+    </cs:lnRef>
+    <cs:fillRef idx="1"/>
+    <cs:effectRef idx="0"/>
+    <cs:fontRef idx="minor">
+      <a:schemeClr val="tx1"/>
+    </cs:fontRef>
+    <cs:spPr>
+      <a:ln w="9525" cap="rnd">
+        <a:solidFill>
+          <a:schemeClr val="phClr"/>
+        </a:solidFill>
+        <a:round/>
+      </a:ln>
+    </cs:spPr>
+  </cs:dataPointWireframe>
+  <cs:dataTable>
+    <cs:lnRef idx="0"/>
+    <cs:fillRef idx="0"/>
+    <cs:effectRef idx="0"/>
+    <cs:fontRef idx="minor">
+      <a:schemeClr val="tx1">
+        <a:lumMod val="65000"/>
+        <a:lumOff val="35000"/>
+      </a:schemeClr>
+    </cs:fontRef>
+    <cs:spPr>
+      <a:noFill/>
+      <a:ln w="9525" cap="flat" cmpd="sng" algn="ctr">
+        <a:solidFill>
+          <a:schemeClr val="tx1">
+            <a:lumMod val="15000"/>
+            <a:lumOff val="85000"/>
+          </a:schemeClr>
+        </a:solidFill>
+        <a:round/>
+      </a:ln>
+    </cs:spPr>
+    <cs:defRPr sz="900" kern="1200"/>
+  </cs:dataTable>
+  <cs:downBar>
+    <cs:lnRef idx="0"/>
+    <cs:fillRef idx="0"/>
+    <cs:effectRef idx="0"/>
+    <cs:fontRef idx="minor">
+      <a:schemeClr val="dk1"/>
+    </cs:fontRef>
+    <cs:spPr>
+      <a:solidFill>
+        <a:schemeClr val="dk1">
+          <a:lumMod val="65000"/>
+          <a:lumOff val="35000"/>
+        </a:schemeClr>
+      </a:solidFill>
+      <a:ln w="9525">
+        <a:solidFill>
+          <a:schemeClr val="tx1">
+            <a:lumMod val="65000"/>
+            <a:lumOff val="35000"/>
+          </a:schemeClr>
+        </a:solidFill>
+      </a:ln>
+    </cs:spPr>
+  </cs:downBar>
+  <cs:dropLine>
+    <cs:lnRef idx="0"/>
+    <cs:fillRef idx="0"/>
+    <cs:effectRef idx="0"/>
+    <cs:fontRef idx="minor">
+      <a:schemeClr val="tx1"/>
+    </cs:fontRef>
+    <cs:spPr>
+      <a:ln w="9525" cap="flat" cmpd="sng" algn="ctr">
+        <a:solidFill>
+          <a:schemeClr val="tx1">
+            <a:lumMod val="35000"/>
+            <a:lumOff val="65000"/>
+          </a:schemeClr>
+        </a:solidFill>
+        <a:round/>
+      </a:ln>
+    </cs:spPr>
+  </cs:dropLine>
+  <cs:errorBar>
+    <cs:lnRef idx="0"/>
+    <cs:fillRef idx="0"/>
+    <cs:effectRef idx="0"/>
+    <cs:fontRef idx="minor">
+      <a:schemeClr val="tx1"/>
+    </cs:fontRef>
+    <cs:spPr>
+      <a:ln w="9525" cap="flat" cmpd="sng" algn="ctr">
+        <a:solidFill>
+          <a:schemeClr val="tx1">
+            <a:lumMod val="65000"/>
+            <a:lumOff val="35000"/>
+          </a:schemeClr>
+        </a:solidFill>
+        <a:round/>
+      </a:ln>
+    </cs:spPr>
+  </cs:errorBar>
+  <cs:floor>
+    <cs:lnRef idx="0"/>
+    <cs:fillRef idx="0"/>
+    <cs:effectRef idx="0"/>
+    <cs:fontRef idx="minor">
+      <a:schemeClr val="tx1"/>
+    </cs:fontRef>
+    <cs:spPr>
+      <a:noFill/>
+      <a:ln>
+        <a:noFill/>
+      </a:ln>
+    </cs:spPr>
+  </cs:floor>
+  <cs:gridlineMajor>
+    <cs:lnRef idx="0"/>
+    <cs:fillRef idx="0"/>
+    <cs:effectRef idx="0"/>
+    <cs:fontRef idx="minor">
+      <a:schemeClr val="tx1"/>
+    </cs:fontRef>
+    <cs:spPr>
+      <a:ln w="9525" cap="flat" cmpd="sng" algn="ctr">
+        <a:solidFill>
+          <a:schemeClr val="tx1">
+            <a:lumMod val="15000"/>
+            <a:lumOff val="85000"/>
+          </a:schemeClr>
+        </a:solidFill>
+        <a:round/>
+      </a:ln>
+    </cs:spPr>
+  </cs:gridlineMajor>
+  <cs:gridlineMinor>
+    <cs:lnRef idx="0"/>
+    <cs:fillRef idx="0"/>
+    <cs:effectRef idx="0"/>
+    <cs:fontRef idx="minor">
+      <a:schemeClr val="tx1"/>
+    </cs:fontRef>
+    <cs:spPr>
+      <a:ln w="9525" cap="flat" cmpd="sng" algn="ctr">
+        <a:solidFill>
+          <a:schemeClr val="tx1">
+            <a:lumMod val="5000"/>
+            <a:lumOff val="95000"/>
+          </a:schemeClr>
+        </a:solidFill>
+        <a:round/>
+      </a:ln>
+    </cs:spPr>
+  </cs:gridlineMinor>
+  <cs:hiLoLine>
+    <cs:lnRef idx="0"/>
+    <cs:fillRef idx="0"/>
+    <cs:effectRef idx="0"/>
+    <cs:fontRef idx="minor">
+      <a:schemeClr val="tx1"/>
+    </cs:fontRef>
+    <cs:spPr>
+      <a:ln w="9525" cap="flat" cmpd="sng" algn="ctr">
+        <a:solidFill>
+          <a:schemeClr val="tx1">
+            <a:lumMod val="75000"/>
+            <a:lumOff val="25000"/>
+          </a:schemeClr>
+        </a:solidFill>
+        <a:round/>
+      </a:ln>
+    </cs:spPr>
+  </cs:hiLoLine>
+  <cs:leaderLine>
+    <cs:lnRef idx="0"/>
+    <cs:fillRef idx="0"/>
+    <cs:effectRef idx="0"/>
+    <cs:fontRef idx="minor">
+      <a:schemeClr val="tx1"/>
+    </cs:fontRef>
+    <cs:spPr>
+      <a:ln w="9525" cap="flat" cmpd="sng" algn="ctr">
+        <a:solidFill>
+          <a:schemeClr val="tx1">
+            <a:lumMod val="35000"/>
+            <a:lumOff val="65000"/>
+          </a:schemeClr>
+        </a:solidFill>
+        <a:round/>
+      </a:ln>
+    </cs:spPr>
+  </cs:leaderLine>
+  <cs:legend>
+    <cs:lnRef idx="0"/>
+    <cs:fillRef idx="0"/>
+    <cs:effectRef idx="0"/>
+    <cs:fontRef idx="minor">
+      <a:schemeClr val="tx1">
+        <a:lumMod val="65000"/>
+        <a:lumOff val="35000"/>
+      </a:schemeClr>
+    </cs:fontRef>
+    <cs:defRPr sz="900" kern="1200"/>
+  </cs:legend>
+  <cs:plotArea mods="allowNoFillOverride allowNoLineOverride">
+    <cs:lnRef idx="0"/>
+    <cs:fillRef idx="0"/>
+    <cs:effectRef idx="0"/>
+    <cs:fontRef idx="minor">
+      <a:schemeClr val="tx1"/>
+    </cs:fontRef>
+  </cs:plotArea>
+  <cs:plotArea3D mods="allowNoFillOverride allowNoLineOverride">
+    <cs:lnRef idx="0"/>
+    <cs:fillRef idx="0"/>
+    <cs:effectRef idx="0"/>
+    <cs:fontRef idx="minor">
+      <a:schemeClr val="tx1"/>
+    </cs:fontRef>
+  </cs:plotArea3D>
+  <cs:seriesAxis>
+    <cs:lnRef idx="0"/>
+    <cs:fillRef idx="0"/>
+    <cs:effectRef idx="0"/>
+    <cs:fontRef idx="minor">
+      <a:schemeClr val="tx1">
+        <a:lumMod val="65000"/>
+        <a:lumOff val="35000"/>
+      </a:schemeClr>
+    </cs:fontRef>
+    <cs:defRPr sz="900" kern="1200"/>
+  </cs:seriesAxis>
+  <cs:seriesLine>
+    <cs:lnRef idx="0"/>
+    <cs:fillRef idx="0"/>
+    <cs:effectRef idx="0"/>
+    <cs:fontRef idx="minor">
+      <a:schemeClr val="tx1"/>
+    </cs:fontRef>
+    <cs:spPr>
+      <a:ln w="9525" cap="flat" cmpd="sng" algn="ctr">
+        <a:solidFill>
+          <a:schemeClr val="tx1">
+            <a:lumMod val="35000"/>
+            <a:lumOff val="65000"/>
+          </a:schemeClr>
+        </a:solidFill>
+        <a:round/>
+      </a:ln>
+    </cs:spPr>
+  </cs:seriesLine>
+  <cs:title>
+    <cs:lnRef idx="0"/>
+    <cs:fillRef idx="0"/>
+    <cs:effectRef idx="0"/>
+    <cs:fontRef idx="minor">
+      <a:schemeClr val="tx1">
+        <a:lumMod val="65000"/>
+        <a:lumOff val="35000"/>
+      </a:schemeClr>
+    </cs:fontRef>
+    <cs:defRPr sz="1400" b="0" kern="1200" spc="0" baseline="0"/>
+  </cs:title>
+  <cs:trendline>
+    <cs:lnRef idx="0">
+      <cs:styleClr val="auto"/>
+    </cs:lnRef>
+    <cs:fillRef idx="0"/>
+    <cs:effectRef idx="0"/>
+    <cs:fontRef idx="minor">
+      <a:schemeClr val="tx1"/>
+    </cs:fontRef>
+    <cs:spPr>
+      <a:ln w="19050" cap="rnd">
+        <a:solidFill>
+          <a:schemeClr val="phClr"/>
+        </a:solidFill>
+        <a:prstDash val="sysDot"/>
+      </a:ln>
+    </cs:spPr>
+  </cs:trendline>
+  <cs:trendlineLabel>
+    <cs:lnRef idx="0"/>
+    <cs:fillRef idx="0"/>
+    <cs:effectRef idx="0"/>
+    <cs:fontRef idx="minor">
+      <a:schemeClr val="tx1">
+        <a:lumMod val="65000"/>
+        <a:lumOff val="35000"/>
+      </a:schemeClr>
+    </cs:fontRef>
+    <cs:defRPr sz="900" kern="1200"/>
+  </cs:trendlineLabel>
+  <cs:upBar>
+    <cs:lnRef idx="0"/>
+    <cs:fillRef idx="0"/>
+    <cs:effectRef idx="0"/>
+    <cs:fontRef idx="minor">
+      <a:schemeClr val="dk1"/>
+    </cs:fontRef>
+    <cs:spPr>
+      <a:solidFill>
+        <a:schemeClr val="lt1"/>
+      </a:solidFill>
+      <a:ln w="9525">
+        <a:solidFill>
+          <a:schemeClr val="tx1">
+            <a:lumMod val="15000"/>
+            <a:lumOff val="85000"/>
+          </a:schemeClr>
+        </a:solidFill>
+      </a:ln>
+    </cs:spPr>
+  </cs:upBar>
+  <cs:valueAxis>
+    <cs:lnRef idx="0"/>
+    <cs:fillRef idx="0"/>
+    <cs:effectRef idx="0"/>
+    <cs:fontRef idx="minor">
+      <a:schemeClr val="tx1">
+        <a:lumMod val="65000"/>
+        <a:lumOff val="35000"/>
+      </a:schemeClr>
+    </cs:fontRef>
+    <cs:defRPr sz="900" kern="1200"/>
+  </cs:valueAxis>
+  <cs:wall>
+    <cs:lnRef idx="0"/>
+    <cs:fillRef idx="0"/>
+    <cs:effectRef idx="0"/>
+    <cs:fontRef idx="minor">
+      <a:schemeClr val="tx1"/>
+    </cs:fontRef>
+    <cs:spPr>
+      <a:noFill/>
+      <a:ln>
+        <a:noFill/>
+      </a:ln>
+    </cs:spPr>
+  </cs:wall>
+</cs:chartStyle>
 </file>
 
 <file path=word/diagrams/colors1.xml><?xml version="1.0" encoding="utf-8"?>

</xml_diff>